<commit_message>
feat: refine contract table and supplier handling
Co-authored-by: Cursor <cursoragent@cursor.com>
</commit_message>
<xml_diff>
--- a/agent/contract/templates/zhanweifu/annual-framework.docx
+++ b/agent/contract/templates/zhanweifu/annual-framework.docx
@@ -98,7 +98,7 @@
                 <w:rFonts w:hint="eastAsia" w:eastAsia="仿宋"/>
                 <w:sz w:val="24"/>
               </w:rPr>
-              <w:t>：{{ contractNo }}</w:t>
+              <w:t>：{{r contractNo }}</w:t>
             </w:r>
           </w:p>
         </w:tc>
@@ -169,7 +169,7 @@
                 <w:rFonts w:hint="eastAsia" w:eastAsia="仿宋"/>
                 <w:sz w:val="24"/>
               </w:rPr>
-              <w:t>：{{ signYear }}年{{ signMonth }}月{{ signDay }}日</w:t>
+              <w:t>：{{r signYear }}年{{r signMonth }}月{{r signDay }}日</w:t>
             </w:r>
           </w:p>
         </w:tc>
@@ -459,7 +459,7 @@
                 <w:rFonts w:eastAsia="仿宋"/>
                 <w:sz w:val="24"/>
               </w:rPr>
-              <w:t>：{{ supplierName }}</w:t>
+              <w:t>：{{r supplierName }}</w:t>
             </w:r>
           </w:p>
           <w:p>
@@ -475,7 +475,7 @@
                 <w:rFonts w:hint="eastAsia" w:eastAsia="仿宋"/>
                 <w:sz w:val="24"/>
               </w:rPr>
-              <w:t xml:space="preserve">地址：{{ supplierAddress }} </w:t>
+              <w:t xml:space="preserve">地址：{{r supplierAddress }} </w:t>
             </w:r>
           </w:p>
           <w:p>
@@ -491,7 +491,7 @@
                 <w:rFonts w:hint="eastAsia" w:eastAsia="仿宋"/>
                 <w:sz w:val="24"/>
               </w:rPr>
-              <w:t>银行帐号：{{ supplierAccount }}</w:t>
+              <w:t>银行帐号：{{r supplierAccount }}</w:t>
             </w:r>
           </w:p>
           <w:p>
@@ -507,7 +507,7 @@
                 <w:rFonts w:hint="eastAsia" w:eastAsia="仿宋"/>
                 <w:sz w:val="24"/>
               </w:rPr>
-              <w:t>税号：{{ supplierTaxNo }}</w:t>
+              <w:t>税号：{{r supplierTaxNo }}</w:t>
             </w:r>
           </w:p>
           <w:p>
@@ -4592,7 +4592,7 @@
           </w:tcPr>
           <w:p>
             <w:r>
-              <w:t>{{ item.index }}</w:t>
+              <w:t>{{r item.index }}</w:t>
             </w:r>
           </w:p>
         </w:tc>
@@ -4602,7 +4602,7 @@
           </w:tcPr>
           <w:p>
             <w:r>
-              <w:t>{{ item.tagNo }}</w:t>
+              <w:t>{{r item.tagNo }}</w:t>
             </w:r>
           </w:p>
         </w:tc>
@@ -4612,7 +4612,7 @@
           </w:tcPr>
           <w:p>
             <w:r>
-              <w:t>{{ item.name }}</w:t>
+              <w:t>{{r item.name }}</w:t>
             </w:r>
           </w:p>
         </w:tc>
@@ -4622,7 +4622,7 @@
           </w:tcPr>
           <w:p>
             <w:r>
-              <w:t>{{ item.spec }}</w:t>
+              <w:t>{{r item.spec }}</w:t>
             </w:r>
           </w:p>
         </w:tc>
@@ -4632,7 +4632,7 @@
           </w:tcPr>
           <w:p>
             <w:r>
-              <w:t>{{ item.unit }}</w:t>
+              <w:t>{{r item.unit }}</w:t>
             </w:r>
           </w:p>
         </w:tc>
@@ -4642,7 +4642,7 @@
           </w:tcPr>
           <w:p>
             <w:r>
-              <w:t>{{ item.quantity }}</w:t>
+              <w:t>{{r item.quantity }}</w:t>
             </w:r>
           </w:p>
         </w:tc>
@@ -4652,7 +4652,7 @@
           </w:tcPr>
           <w:p>
             <w:r>
-              <w:t>{{ item.deliveryDays }}</w:t>
+              <w:t>{{r item.deliveryDays }}</w:t>
             </w:r>
           </w:p>
         </w:tc>
@@ -4662,7 +4662,7 @@
           </w:tcPr>
           <w:p>
             <w:r>
-              <w:t>{{ item.unitPrice }}</w:t>
+              <w:t>{{r item.unitPrice }}</w:t>
             </w:r>
           </w:p>
         </w:tc>
@@ -4672,7 +4672,7 @@
           </w:tcPr>
           <w:p>
             <w:r>
-              <w:t>{{ item.totalPrice }}</w:t>
+              <w:t>{{r item.totalPrice }}</w:t>
             </w:r>
           </w:p>
         </w:tc>
@@ -4682,7 +4682,7 @@
           </w:tcPr>
           <w:p>
             <w:r>
-              <w:t>{{ item.remark }}</w:t>
+              <w:t>{{r item.remark }}</w:t>
             </w:r>
           </w:p>
         </w:tc>
@@ -5985,7 +5985,7 @@
                 <w:rFonts w:hint="eastAsia" w:eastAsia="仿宋"/>
                 <w:sz w:val="24"/>
               </w:rPr>
-              <w:t>{{ priceItem.name }}</w:t>
+              <w:t>{{r priceItem.name }}</w:t>
             </w:r>
           </w:p>
         </w:tc>
@@ -6002,7 +6002,7 @@
                 <w:rFonts w:hint="eastAsia" w:eastAsia="仿宋"/>
                 <w:sz w:val="24"/>
               </w:rPr>
-              <w:t>{{ priceItem.model }}</w:t>
+              <w:t>{{r priceItem.model }}</w:t>
             </w:r>
           </w:p>
         </w:tc>
@@ -6019,7 +6019,7 @@
                 <w:rFonts w:hint="eastAsia" w:eastAsia="仿宋"/>
                 <w:sz w:val="24"/>
               </w:rPr>
-              <w:t>{{ priceItem.unitPrice }}</w:t>
+              <w:t>{{r priceItem.unitPrice }}</w:t>
             </w:r>
           </w:p>
         </w:tc>
@@ -6036,7 +6036,7 @@
                 <w:rFonts w:hint="eastAsia" w:eastAsia="仿宋"/>
                 <w:sz w:val="24"/>
               </w:rPr>
-              <w:t>{{ priceItem.params }}</w:t>
+              <w:t>{{r priceItem.params }}</w:t>
             </w:r>
           </w:p>
         </w:tc>
@@ -6053,7 +6053,7 @@
                 <w:rFonts w:hint="eastAsia" w:eastAsia="仿宋"/>
                 <w:sz w:val="24"/>
               </w:rPr>
-              <w:t>{{ priceItem.remark }}</w:t>
+              <w:t>{{r priceItem.remark }}</w:t>
             </w:r>
           </w:p>
         </w:tc>

</xml_diff>

<commit_message>
fix: clean attachment output and expand annual placeholders
Prevent empty attachment tail pages in contract rendering and extend annual framework template placeholders so key supplier and delivery blanks can be filled through extracted data.
</commit_message>
<xml_diff>
--- a/agent/contract/templates/zhanweifu/annual-framework.docx
+++ b/agent/contract/templates/zhanweifu/annual-framework.docx
@@ -523,7 +523,7 @@
                 <w:rFonts w:hint="eastAsia" w:eastAsia="仿宋"/>
                 <w:sz w:val="24"/>
               </w:rPr>
-              <w:t xml:space="preserve">电话（Tel）： </w:t>
+              <w:t>电话（Tel）：{{r supplierPhone }}</w:t>
             </w:r>
           </w:p>
           <w:p>
@@ -539,7 +539,7 @@
                 <w:rFonts w:hint="eastAsia" w:eastAsia="仿宋"/>
                 <w:sz w:val="24"/>
               </w:rPr>
-              <w:t>传真（Fax）：</w:t>
+              <w:t>传真（Fax）：{{r supplierFax }}</w:t>
             </w:r>
           </w:p>
           <w:p>
@@ -556,7 +556,7 @@
                 <w:rFonts w:hint="eastAsia" w:eastAsia="仿宋"/>
                 <w:sz w:val="24"/>
               </w:rPr>
-              <w:t>联系人：</w:t>
+              <w:t>联系人：{{r supplierRepresentativeName }}</w:t>
             </w:r>
           </w:p>
         </w:tc>
@@ -3125,7 +3125,11 @@
           <w:rFonts w:hint="eastAsia" w:ascii="仿宋" w:hAnsi="仿宋" w:eastAsia="仿宋" w:cs="仿宋"/>
           <w:sz w:val="24"/>
         </w:rPr>
-        <w:t>联络人：</w:t>
+        <w:t>联络人：{{r supplierRepresentativeName }}</w:t>
+        <w:tab/>
+        <w:tab/>
+        <w:tab/>
+        <w:t>联系方式：{{r supplierRepresentativePhone }}</w:t>
       </w:r>
       <w:r>
         <w:rPr>
@@ -3133,7 +3137,6 @@
           <w:sz w:val="24"/>
           <w:u w:val="single"/>
         </w:rPr>
-        <w:tab/>
       </w:r>
       <w:r>
         <w:rPr>
@@ -3141,7 +3144,6 @@
           <w:sz w:val="24"/>
           <w:u w:val="single"/>
         </w:rPr>
-        <w:tab/>
       </w:r>
       <w:r>
         <w:rPr>
@@ -3149,7 +3151,6 @@
           <w:sz w:val="24"/>
           <w:u w:val="single"/>
         </w:rPr>
-        <w:tab/>
       </w:r>
       <w:r>
         <w:rPr>
@@ -3157,7 +3158,6 @@
           <w:sz w:val="24"/>
           <w:u w:val="single"/>
         </w:rPr>
-        <w:tab/>
       </w:r>
       <w:r>
         <w:rPr>
@@ -3165,7 +3165,6 @@
           <w:sz w:val="24"/>
           <w:u w:val="single"/>
         </w:rPr>
-        <w:tab/>
       </w:r>
       <w:r>
         <w:rPr>
@@ -3173,14 +3172,12 @@
           <w:sz w:val="24"/>
           <w:u w:val="single"/>
         </w:rPr>
-        <w:t xml:space="preserve"> </w:t>
-      </w:r>
-      <w:r>
-        <w:rPr>
-          <w:rFonts w:hint="eastAsia" w:ascii="仿宋" w:hAnsi="仿宋" w:eastAsia="仿宋" w:cs="仿宋"/>
-          <w:sz w:val="24"/>
-        </w:rPr>
-        <w:t xml:space="preserve">   联系方式：</w:t>
+      </w:r>
+      <w:r>
+        <w:rPr>
+          <w:rFonts w:hint="eastAsia" w:ascii="仿宋" w:hAnsi="仿宋" w:eastAsia="仿宋" w:cs="仿宋"/>
+          <w:sz w:val="24"/>
+        </w:rPr>
       </w:r>
       <w:r>
         <w:rPr>
@@ -3188,7 +3185,6 @@
           <w:sz w:val="24"/>
           <w:u w:val="single"/>
         </w:rPr>
-        <w:tab/>
       </w:r>
       <w:r>
         <w:rPr>
@@ -3196,7 +3192,6 @@
           <w:sz w:val="24"/>
           <w:u w:val="single"/>
         </w:rPr>
-        <w:tab/>
       </w:r>
       <w:r>
         <w:rPr>
@@ -3204,7 +3199,6 @@
           <w:sz w:val="24"/>
           <w:u w:val="single"/>
         </w:rPr>
-        <w:tab/>
       </w:r>
       <w:r>
         <w:rPr>
@@ -3212,7 +3206,6 @@
           <w:sz w:val="24"/>
           <w:u w:val="single"/>
         </w:rPr>
-        <w:tab/>
       </w:r>
       <w:r>
         <w:rPr>
@@ -3220,7 +3213,6 @@
           <w:sz w:val="24"/>
           <w:u w:val="single"/>
         </w:rPr>
-        <w:tab/>
       </w:r>
     </w:p>
     <w:p>
@@ -3237,7 +3229,7 @@
           <w:rFonts w:hint="eastAsia" w:ascii="仿宋" w:hAnsi="仿宋" w:eastAsia="仿宋" w:cs="仿宋"/>
           <w:sz w:val="24"/>
         </w:rPr>
-        <w:t>联系地址：</w:t>
+        <w:t>联系地址：{{r supplierRepresentativeAddress }}    邮箱：{{r supplierRepresentativeEmail }}</w:t>
       </w:r>
       <w:r>
         <w:rPr>
@@ -3245,14 +3237,12 @@
           <w:sz w:val="24"/>
           <w:u w:val="single"/>
         </w:rPr>
-        <w:t xml:space="preserve">               </w:t>
-      </w:r>
-      <w:r>
-        <w:rPr>
-          <w:rFonts w:hint="eastAsia" w:ascii="仿宋" w:hAnsi="仿宋" w:eastAsia="仿宋" w:cs="仿宋"/>
-          <w:sz w:val="24"/>
-        </w:rPr>
-        <w:t xml:space="preserve">   邮箱：</w:t>
+      </w:r>
+      <w:r>
+        <w:rPr>
+          <w:rFonts w:hint="eastAsia" w:ascii="仿宋" w:hAnsi="仿宋" w:eastAsia="仿宋" w:cs="仿宋"/>
+          <w:sz w:val="24"/>
+        </w:rPr>
       </w:r>
       <w:r>
         <w:rPr>
@@ -3260,14 +3250,12 @@
           <w:sz w:val="24"/>
           <w:u w:val="single"/>
         </w:rPr>
-        <w:t xml:space="preserve">               </w:t>
-      </w:r>
-      <w:r>
-        <w:rPr>
-          <w:rFonts w:hint="eastAsia" w:ascii="仿宋" w:hAnsi="仿宋" w:eastAsia="仿宋" w:cs="仿宋"/>
-          <w:sz w:val="24"/>
-        </w:rPr>
-        <w:t xml:space="preserve"> </w:t>
+      </w:r>
+      <w:r>
+        <w:rPr>
+          <w:rFonts w:hint="eastAsia" w:ascii="仿宋" w:hAnsi="仿宋" w:eastAsia="仿宋" w:cs="仿宋"/>
+          <w:sz w:val="24"/>
+        </w:rPr>
       </w:r>
     </w:p>
     <w:p>
@@ -3737,14 +3725,13 @@
           <w:bCs/>
           <w:sz w:val="24"/>
         </w:rPr>
-        <w:t>甲方：</w:t>
-      </w:r>
-      <w:r>
-        <w:rPr>
-          <w:rFonts w:hint="eastAsia" w:ascii="仿宋" w:hAnsi="仿宋" w:eastAsia="仿宋" w:cs="仿宋"/>
-          <w:sz w:val="24"/>
-        </w:rPr>
-        <w:t xml:space="preserve">浙江沃乐科技股份有限公司          </w:t>
+        <w:t>甲方：浙江沃乐科技股份有限公司          乙方：{{r supplierName }}</w:t>
+      </w:r>
+      <w:r>
+        <w:rPr>
+          <w:rFonts w:hint="eastAsia" w:ascii="仿宋" w:hAnsi="仿宋" w:eastAsia="仿宋" w:cs="仿宋"/>
+          <w:sz w:val="24"/>
+        </w:rPr>
       </w:r>
       <w:r>
         <w:rPr>
@@ -3753,23 +3740,22 @@
           <w:bCs/>
           <w:sz w:val="24"/>
         </w:rPr>
-        <w:t>乙方：</w:t>
-      </w:r>
-    </w:p>
-    <w:p>
-      <w:pPr>
-        <w:spacing w:line="360" w:lineRule="auto"/>
-        <w:rPr>
-          <w:rFonts w:hint="eastAsia" w:ascii="仿宋" w:hAnsi="仿宋" w:eastAsia="仿宋" w:cs="仿宋"/>
-          <w:sz w:val="24"/>
-        </w:rPr>
-      </w:pPr>
-      <w:r>
-        <w:rPr>
-          <w:rFonts w:hint="eastAsia" w:ascii="仿宋" w:hAnsi="仿宋" w:eastAsia="仿宋" w:cs="仿宋"/>
-          <w:sz w:val="24"/>
-        </w:rPr>
-        <w:t>授权代表：</w:t>
+      </w:r>
+    </w:p>
+    <w:p>
+      <w:pPr>
+        <w:spacing w:line="360" w:lineRule="auto"/>
+        <w:rPr>
+          <w:rFonts w:hint="eastAsia" w:ascii="仿宋" w:hAnsi="仿宋" w:eastAsia="仿宋" w:cs="仿宋"/>
+          <w:sz w:val="24"/>
+        </w:rPr>
+      </w:pPr>
+      <w:r>
+        <w:rPr>
+          <w:rFonts w:hint="eastAsia" w:ascii="仿宋" w:hAnsi="仿宋" w:eastAsia="仿宋" w:cs="仿宋"/>
+          <w:sz w:val="24"/>
+        </w:rPr>
+        <w:t>授权代表：                              授权代表：{{r supplierAuthorizedRepresentative }}</w:t>
       </w:r>
       <w:r>
         <w:rPr>
@@ -3777,14 +3763,12 @@
           <w:sz w:val="24"/>
           <w:u w:val="single"/>
         </w:rPr>
-        <w:t xml:space="preserve">    </w:t>
-      </w:r>
-      <w:r>
-        <w:rPr>
-          <w:rFonts w:hint="eastAsia" w:ascii="仿宋" w:hAnsi="仿宋" w:eastAsia="仿宋" w:cs="仿宋"/>
-          <w:sz w:val="24"/>
-        </w:rPr>
-        <w:t xml:space="preserve">                          授权代表：</w:t>
+      </w:r>
+      <w:r>
+        <w:rPr>
+          <w:rFonts w:hint="eastAsia" w:ascii="仿宋" w:hAnsi="仿宋" w:eastAsia="仿宋" w:cs="仿宋"/>
+          <w:sz w:val="24"/>
+        </w:rPr>
       </w:r>
       <w:r>
         <w:rPr>
@@ -3792,7 +3776,6 @@
           <w:sz w:val="24"/>
           <w:u w:val="single"/>
         </w:rPr>
-        <w:t xml:space="preserve">            </w:t>
       </w:r>
     </w:p>
     <w:p>
@@ -3820,7 +3803,7 @@
           <w:rFonts w:hint="eastAsia" w:ascii="仿宋" w:hAnsi="仿宋" w:eastAsia="仿宋" w:cs="仿宋"/>
           <w:sz w:val="24"/>
         </w:rPr>
-        <w:t>日期：</w:t>
+        <w:t>日期：    年   月                       日期：{{r signatureYear }}年{{r signatureMonth }}月{{r signatureDay }}日</w:t>
       </w:r>
       <w:r>
         <w:rPr>
@@ -3828,14 +3811,12 @@
           <w:sz w:val="24"/>
           <w:u w:val="single"/>
         </w:rPr>
-        <w:t xml:space="preserve">    </w:t>
-      </w:r>
-      <w:r>
-        <w:rPr>
-          <w:rFonts w:hint="eastAsia" w:ascii="仿宋" w:hAnsi="仿宋" w:eastAsia="仿宋" w:cs="仿宋"/>
-          <w:sz w:val="24"/>
-        </w:rPr>
-        <w:t>年</w:t>
+      </w:r>
+      <w:r>
+        <w:rPr>
+          <w:rFonts w:hint="eastAsia" w:ascii="仿宋" w:hAnsi="仿宋" w:eastAsia="仿宋" w:cs="仿宋"/>
+          <w:sz w:val="24"/>
+        </w:rPr>
       </w:r>
       <w:r>
         <w:rPr>
@@ -3843,14 +3824,12 @@
           <w:sz w:val="24"/>
           <w:u w:val="single"/>
         </w:rPr>
-        <w:t xml:space="preserve">   </w:t>
-      </w:r>
-      <w:r>
-        <w:rPr>
-          <w:rFonts w:hint="eastAsia" w:ascii="仿宋" w:hAnsi="仿宋" w:eastAsia="仿宋" w:cs="仿宋"/>
-          <w:sz w:val="24"/>
-        </w:rPr>
-        <w:t>月</w:t>
+      </w:r>
+      <w:r>
+        <w:rPr>
+          <w:rFonts w:hint="eastAsia" w:ascii="仿宋" w:hAnsi="仿宋" w:eastAsia="仿宋" w:cs="仿宋"/>
+          <w:sz w:val="24"/>
+        </w:rPr>
       </w:r>
       <w:r>
         <w:rPr>
@@ -3858,14 +3837,12 @@
           <w:sz w:val="24"/>
           <w:u w:val="single"/>
         </w:rPr>
-        <w:t xml:space="preserve">    </w:t>
-      </w:r>
-      <w:r>
-        <w:rPr>
-          <w:rFonts w:hint="eastAsia" w:ascii="仿宋" w:hAnsi="仿宋" w:eastAsia="仿宋" w:cs="仿宋"/>
-          <w:sz w:val="24"/>
-        </w:rPr>
-        <w:t xml:space="preserve">                   日期：</w:t>
+      </w:r>
+      <w:r>
+        <w:rPr>
+          <w:rFonts w:hint="eastAsia" w:ascii="仿宋" w:hAnsi="仿宋" w:eastAsia="仿宋" w:cs="仿宋"/>
+          <w:sz w:val="24"/>
+        </w:rPr>
       </w:r>
       <w:r>
         <w:rPr>
@@ -3873,14 +3850,12 @@
           <w:sz w:val="24"/>
           <w:u w:val="single"/>
         </w:rPr>
-        <w:t xml:space="preserve">    </w:t>
-      </w:r>
-      <w:r>
-        <w:rPr>
-          <w:rFonts w:hint="eastAsia" w:ascii="仿宋" w:hAnsi="仿宋" w:eastAsia="仿宋" w:cs="仿宋"/>
-          <w:sz w:val="24"/>
-        </w:rPr>
-        <w:t>年</w:t>
+      </w:r>
+      <w:r>
+        <w:rPr>
+          <w:rFonts w:hint="eastAsia" w:ascii="仿宋" w:hAnsi="仿宋" w:eastAsia="仿宋" w:cs="仿宋"/>
+          <w:sz w:val="24"/>
+        </w:rPr>
       </w:r>
       <w:r>
         <w:rPr>
@@ -3888,14 +3863,12 @@
           <w:sz w:val="24"/>
           <w:u w:val="single"/>
         </w:rPr>
-        <w:t xml:space="preserve">    </w:t>
-      </w:r>
-      <w:r>
-        <w:rPr>
-          <w:rFonts w:hint="eastAsia" w:ascii="仿宋" w:hAnsi="仿宋" w:eastAsia="仿宋" w:cs="仿宋"/>
-          <w:sz w:val="24"/>
-        </w:rPr>
-        <w:t>月</w:t>
+      </w:r>
+      <w:r>
+        <w:rPr>
+          <w:rFonts w:hint="eastAsia" w:ascii="仿宋" w:hAnsi="仿宋" w:eastAsia="仿宋" w:cs="仿宋"/>
+          <w:sz w:val="24"/>
+        </w:rPr>
       </w:r>
       <w:r>
         <w:rPr>
@@ -3903,14 +3876,12 @@
           <w:sz w:val="24"/>
           <w:u w:val="single"/>
         </w:rPr>
-        <w:t xml:space="preserve">   </w:t>
-      </w:r>
-      <w:r>
-        <w:rPr>
-          <w:rFonts w:hint="eastAsia" w:ascii="仿宋" w:hAnsi="仿宋" w:eastAsia="仿宋" w:cs="仿宋"/>
-          <w:sz w:val="24"/>
-        </w:rPr>
-        <w:t>日</w:t>
+      </w:r>
+      <w:r>
+        <w:rPr>
+          <w:rFonts w:hint="eastAsia" w:ascii="仿宋" w:hAnsi="仿宋" w:eastAsia="仿宋" w:cs="仿宋"/>
+          <w:sz w:val="24"/>
+        </w:rPr>
       </w:r>
     </w:p>
     <w:p>
@@ -5658,7 +5629,7 @@
         <w:rPr>
           <w:rFonts w:hint="eastAsia"/>
         </w:rPr>
-        <w:t>交货地址：                      收货人：</w:t>
+        <w:t>交货地址：{{r deliveryPlace }}                      收货人：{{r consignee }}</w:t>
       </w:r>
     </w:p>
     <w:p>
@@ -5688,7 +5659,7 @@
           <w:rFonts w:hint="eastAsia"/>
           <w:u w:val="single"/>
         </w:rPr>
-        <w:t>202 年  月      日</w:t>
+        <w:t>{{r deliveryYear }}年{{r deliveryMonth }}月{{r deliveryDay }}日</w:t>
       </w:r>
       <w:r>
         <w:rPr>

</xml_diff>

<commit_message>
feat: unify contract template body typography per template type
Co-authored-by: Cursor <cursoragent@cursor.com>
</commit_message>
<xml_diff>
--- a/agent/contract/templates/zhanweifu/annual-framework.docx
+++ b/agent/contract/templates/zhanweifu/annual-framework.docx
@@ -88,15 +88,15 @@
             </w:pPr>
             <w:r>
               <w:rPr>
-                <w:rFonts w:eastAsia="仿宋"/>
-                <w:sz w:val="24"/>
+                <w:rFonts w:eastAsia="仿宋" w:ascii="仿宋" w:hAnsi="仿宋"/>
+                <w:sz w:val="21"/>
               </w:rPr>
               <w:t>合同编号</w:t>
             </w:r>
             <w:r>
               <w:rPr>
-                <w:rFonts w:hint="eastAsia" w:eastAsia="仿宋"/>
-                <w:sz w:val="24"/>
+                <w:rFonts w:hint="eastAsia" w:eastAsia="仿宋" w:ascii="仿宋" w:hAnsi="仿宋"/>
+                <w:sz w:val="21"/>
               </w:rPr>
               <w:t>：{{r contractNo }}</w:t>
             </w:r>
@@ -117,15 +117,15 @@
             </w:pPr>
             <w:r>
               <w:rPr>
-                <w:rFonts w:eastAsia="仿宋"/>
-                <w:sz w:val="24"/>
+                <w:rFonts w:eastAsia="仿宋" w:ascii="仿宋" w:hAnsi="仿宋"/>
+                <w:sz w:val="21"/>
               </w:rPr>
               <w:t>签订地点：</w:t>
             </w:r>
             <w:r>
               <w:rPr>
-                <w:rFonts w:hint="eastAsia" w:eastAsia="仿宋"/>
-                <w:sz w:val="24"/>
+                <w:rFonts w:hint="eastAsia" w:eastAsia="仿宋" w:ascii="仿宋" w:hAnsi="仿宋"/>
+                <w:sz w:val="21"/>
               </w:rPr>
               <w:t>杭州市余杭区</w:t>
             </w:r>
@@ -159,15 +159,15 @@
             </w:pPr>
             <w:r>
               <w:rPr>
-                <w:rFonts w:eastAsia="仿宋"/>
-                <w:sz w:val="24"/>
+                <w:rFonts w:eastAsia="仿宋" w:ascii="仿宋" w:hAnsi="仿宋"/>
+                <w:sz w:val="21"/>
               </w:rPr>
               <w:t>签订日期</w:t>
             </w:r>
             <w:r>
               <w:rPr>
-                <w:rFonts w:hint="eastAsia" w:eastAsia="仿宋"/>
-                <w:sz w:val="24"/>
+                <w:rFonts w:hint="eastAsia" w:eastAsia="仿宋" w:ascii="仿宋" w:hAnsi="仿宋"/>
+                <w:sz w:val="21"/>
               </w:rPr>
               <w:t>：{{r signYear }}年{{r signMonth }}月{{r signDay }}日</w:t>
             </w:r>
@@ -203,8 +203,8 @@
       </w:pPr>
       <w:r>
         <w:rPr>
-          <w:rFonts w:eastAsia="仿宋"/>
-          <w:sz w:val="24"/>
+          <w:rFonts w:eastAsia="仿宋" w:ascii="仿宋" w:hAnsi="仿宋"/>
+          <w:sz w:val="21"/>
         </w:rPr>
         <w:t xml:space="preserve">                                                              </w:t>
       </w:r>
@@ -277,23 +277,23 @@
             </w:pPr>
             <w:r>
               <w:rPr>
-                <w:rFonts w:eastAsia="仿宋"/>
+                <w:rFonts w:eastAsia="仿宋" w:ascii="仿宋" w:hAnsi="仿宋"/>
                 <w:b/>
-                <w:sz w:val="24"/>
+                <w:sz w:val="21"/>
               </w:rPr>
               <w:t>需方（甲方）</w:t>
             </w:r>
             <w:r>
               <w:rPr>
-                <w:rFonts w:eastAsia="仿宋"/>
-                <w:sz w:val="24"/>
+                <w:rFonts w:eastAsia="仿宋" w:ascii="仿宋" w:hAnsi="仿宋"/>
+                <w:sz w:val="21"/>
               </w:rPr>
               <w:t>：</w:t>
             </w:r>
             <w:r>
               <w:rPr>
-                <w:rFonts w:hint="eastAsia" w:eastAsia="仿宋"/>
-                <w:sz w:val="24"/>
+                <w:rFonts w:hint="eastAsia" w:eastAsia="仿宋" w:ascii="仿宋" w:hAnsi="仿宋"/>
+                <w:sz w:val="21"/>
               </w:rPr>
               <w:t>浙江沃乐科技股份有限公司</w:t>
             </w:r>
@@ -308,22 +308,22 @@
             </w:pPr>
             <w:r>
               <w:rPr>
-                <w:rFonts w:hint="eastAsia" w:eastAsia="仿宋"/>
-                <w:sz w:val="24"/>
+                <w:rFonts w:hint="eastAsia" w:eastAsia="仿宋" w:ascii="仿宋" w:hAnsi="仿宋"/>
+                <w:sz w:val="21"/>
               </w:rPr>
               <w:t>联系</w:t>
             </w:r>
             <w:r>
               <w:rPr>
-                <w:rFonts w:eastAsia="仿宋"/>
-                <w:sz w:val="24"/>
+                <w:rFonts w:eastAsia="仿宋" w:ascii="仿宋" w:hAnsi="仿宋"/>
+                <w:sz w:val="21"/>
               </w:rPr>
               <w:t>地址：</w:t>
             </w:r>
             <w:r>
               <w:rPr>
-                <w:rFonts w:hint="eastAsia" w:eastAsia="仿宋"/>
-                <w:sz w:val="24"/>
+                <w:rFonts w:hint="eastAsia" w:eastAsia="仿宋" w:ascii="仿宋" w:hAnsi="仿宋"/>
+                <w:sz w:val="21"/>
               </w:rPr>
               <w:t>浙江省杭州市余杭区仓前街道仓兴街397号18幢5层</w:t>
             </w:r>
@@ -338,15 +338,15 @@
             </w:pPr>
             <w:r>
               <w:rPr>
-                <w:rFonts w:eastAsia="仿宋"/>
-                <w:sz w:val="24"/>
+                <w:rFonts w:eastAsia="仿宋" w:ascii="仿宋" w:hAnsi="仿宋"/>
+                <w:sz w:val="21"/>
               </w:rPr>
               <w:t>开户银行：</w:t>
             </w:r>
             <w:r>
               <w:rPr>
-                <w:rFonts w:hint="eastAsia" w:eastAsia="仿宋"/>
-                <w:sz w:val="24"/>
+                <w:rFonts w:hint="eastAsia" w:eastAsia="仿宋" w:ascii="仿宋" w:hAnsi="仿宋"/>
+                <w:sz w:val="21"/>
               </w:rPr>
               <w:t>上海浦东发展银行股份有限公司杭州余杭支行</w:t>
             </w:r>
@@ -361,15 +361,15 @@
             </w:pPr>
             <w:r>
               <w:rPr>
-                <w:rFonts w:hint="eastAsia" w:eastAsia="仿宋"/>
-                <w:sz w:val="24"/>
+                <w:rFonts w:hint="eastAsia" w:eastAsia="仿宋" w:ascii="仿宋" w:hAnsi="仿宋"/>
+                <w:sz w:val="21"/>
               </w:rPr>
               <w:t>银行账号</w:t>
             </w:r>
             <w:r>
               <w:rPr>
-                <w:rFonts w:eastAsia="仿宋"/>
-                <w:sz w:val="24"/>
+                <w:rFonts w:eastAsia="仿宋" w:ascii="仿宋" w:hAnsi="仿宋"/>
+                <w:sz w:val="21"/>
               </w:rPr>
               <w:t xml:space="preserve">：95260078801100000902 </w:t>
             </w:r>
@@ -384,8 +384,8 @@
             </w:pPr>
             <w:r>
               <w:rPr>
-                <w:rFonts w:eastAsia="仿宋"/>
-                <w:sz w:val="24"/>
+                <w:rFonts w:eastAsia="仿宋" w:ascii="仿宋" w:hAnsi="仿宋"/>
+                <w:sz w:val="21"/>
               </w:rPr>
               <w:t>税号： 91330110MA2HYAEK1T(1/1)</w:t>
             </w:r>
@@ -402,8 +402,8 @@
             </w:pPr>
             <w:r>
               <w:rPr>
-                <w:rFonts w:eastAsia="仿宋"/>
-                <w:sz w:val="24"/>
+                <w:rFonts w:eastAsia="仿宋" w:ascii="仿宋" w:hAnsi="仿宋"/>
+                <w:sz w:val="21"/>
               </w:rPr>
               <w:t xml:space="preserve">电话（Tel）： </w:t>
             </w:r>
@@ -420,8 +420,8 @@
             </w:pPr>
             <w:r>
               <w:rPr>
-                <w:rFonts w:eastAsia="仿宋"/>
-                <w:sz w:val="24"/>
+                <w:rFonts w:eastAsia="仿宋" w:ascii="仿宋" w:hAnsi="仿宋"/>
+                <w:sz w:val="21"/>
               </w:rPr>
               <w:t xml:space="preserve">传真（Fax）： </w:t>
             </w:r>
@@ -448,16 +448,16 @@
             </w:pPr>
             <w:r>
               <w:rPr>
-                <w:rFonts w:eastAsia="仿宋"/>
+                <w:rFonts w:eastAsia="仿宋" w:ascii="仿宋" w:hAnsi="仿宋"/>
                 <w:b/>
-                <w:sz w:val="24"/>
+                <w:sz w:val="21"/>
               </w:rPr>
               <w:t>供方（乙方）</w:t>
             </w:r>
             <w:r>
               <w:rPr>
-                <w:rFonts w:eastAsia="仿宋"/>
-                <w:sz w:val="24"/>
+                <w:rFonts w:eastAsia="仿宋" w:ascii="仿宋" w:hAnsi="仿宋"/>
+                <w:sz w:val="21"/>
               </w:rPr>
               <w:t>：{{r supplierName }}</w:t>
             </w:r>
@@ -472,8 +472,8 @@
             </w:pPr>
             <w:r>
               <w:rPr>
-                <w:rFonts w:hint="eastAsia" w:eastAsia="仿宋"/>
-                <w:sz w:val="24"/>
+                <w:rFonts w:hint="eastAsia" w:eastAsia="仿宋" w:ascii="仿宋" w:hAnsi="仿宋"/>
+                <w:sz w:val="21"/>
               </w:rPr>
               <w:t xml:space="preserve">地址：{{r supplierAddress }} </w:t>
             </w:r>
@@ -488,8 +488,8 @@
             </w:pPr>
             <w:r>
               <w:rPr>
-                <w:rFonts w:hint="eastAsia" w:eastAsia="仿宋"/>
-                <w:sz w:val="24"/>
+                <w:rFonts w:hint="eastAsia" w:eastAsia="仿宋" w:ascii="仿宋" w:hAnsi="仿宋"/>
+                <w:sz w:val="21"/>
               </w:rPr>
               <w:t>银行帐号：{{r supplierAccount }}</w:t>
             </w:r>
@@ -504,8 +504,8 @@
             </w:pPr>
             <w:r>
               <w:rPr>
-                <w:rFonts w:hint="eastAsia" w:eastAsia="仿宋"/>
-                <w:sz w:val="24"/>
+                <w:rFonts w:hint="eastAsia" w:eastAsia="仿宋" w:ascii="仿宋" w:hAnsi="仿宋"/>
+                <w:sz w:val="21"/>
               </w:rPr>
               <w:t>税号：{{r supplierTaxNo }}</w:t>
             </w:r>
@@ -520,8 +520,8 @@
             </w:pPr>
             <w:r>
               <w:rPr>
-                <w:rFonts w:hint="eastAsia" w:eastAsia="仿宋"/>
-                <w:sz w:val="24"/>
+                <w:rFonts w:hint="eastAsia" w:eastAsia="仿宋" w:ascii="仿宋" w:hAnsi="仿宋"/>
+                <w:sz w:val="21"/>
               </w:rPr>
               <w:t>电话（Tel）：{{r supplierPhone }}</w:t>
             </w:r>
@@ -536,8 +536,8 @@
             </w:pPr>
             <w:r>
               <w:rPr>
-                <w:rFonts w:hint="eastAsia" w:eastAsia="仿宋"/>
-                <w:sz w:val="24"/>
+                <w:rFonts w:hint="eastAsia" w:eastAsia="仿宋" w:ascii="仿宋" w:hAnsi="仿宋"/>
+                <w:sz w:val="21"/>
               </w:rPr>
               <w:t>传真（Fax）：{{r supplierFax }}</w:t>
             </w:r>
@@ -553,8 +553,8 @@
             </w:pPr>
             <w:r>
               <w:rPr>
-                <w:rFonts w:hint="eastAsia" w:eastAsia="仿宋"/>
-                <w:sz w:val="24"/>
+                <w:rFonts w:hint="eastAsia" w:eastAsia="仿宋" w:ascii="仿宋" w:hAnsi="仿宋"/>
+                <w:sz w:val="21"/>
               </w:rPr>
               <w:t>联系人：{{r supplierRepresentativeName }}</w:t>
             </w:r>
@@ -584,6 +584,10 @@
         </w:rPr>
       </w:pPr>
       <w:r>
+        <w:rPr>
+          <w:rFonts w:ascii="仿宋" w:hAnsi="仿宋" w:eastAsia="仿宋"/>
+          <w:sz w:val="21"/>
+        </w:rPr>
         <w:t>为提高规模采购效益，明确双方在合作中的权利和义务，根据《中华人民共和国民法典》等相关法律法规规定，就甲方向乙方采购{{r purchaseSubject }}（下称“货物”）事宜， 双方本着长期合作、互惠互利的原则，经友好协商签署本采购框架合同（下称“本合同”），以资共同遵守。</w:t>
       </w:r>
     </w:p>
@@ -600,7 +604,7 @@
         <w:rPr>
           <w:rFonts w:hint="eastAsia" w:ascii="仿宋" w:hAnsi="仿宋" w:eastAsia="仿宋" w:cs="仿宋"/>
           <w:b/>
-          <w:sz w:val="24"/>
+          <w:sz w:val="21"/>
         </w:rPr>
         <w:t>采购货物及价格</w:t>
       </w:r>
@@ -625,7 +629,7 @@
       <w:r>
         <w:rPr>
           <w:rFonts w:hint="eastAsia" w:ascii="仿宋" w:hAnsi="仿宋" w:eastAsia="仿宋" w:cs="仿宋"/>
-          <w:sz w:val="24"/>
+          <w:sz w:val="21"/>
           <w:lang w:val="zh-CN"/>
         </w:rPr>
         <w:t>本合同为框架合同，甲方所需货物清单</w:t>
@@ -633,14 +637,14 @@
       <w:r>
         <w:rPr>
           <w:rFonts w:hint="eastAsia" w:ascii="仿宋" w:hAnsi="仿宋" w:eastAsia="仿宋" w:cs="仿宋"/>
-          <w:sz w:val="24"/>
+          <w:sz w:val="21"/>
         </w:rPr>
         <w:t>以双方每次确认的《采购</w:t>
       </w:r>
       <w:r>
         <w:rPr>
           <w:rFonts w:hint="eastAsia" w:ascii="仿宋" w:hAnsi="仿宋" w:eastAsia="仿宋" w:cs="仿宋"/>
-          <w:sz w:val="24"/>
+          <w:sz w:val="21"/>
           <w:lang w:val="zh-CN"/>
         </w:rPr>
         <w:t>订单》（</w:t>
@@ -648,14 +652,14 @@
       <w:r>
         <w:rPr>
           <w:rFonts w:hint="eastAsia" w:ascii="仿宋" w:hAnsi="仿宋" w:eastAsia="仿宋" w:cs="仿宋"/>
-          <w:sz w:val="24"/>
+          <w:sz w:val="21"/>
         </w:rPr>
         <w:t>附件一）</w:t>
       </w:r>
       <w:r>
         <w:rPr>
           <w:rFonts w:hint="eastAsia" w:ascii="仿宋" w:hAnsi="仿宋" w:eastAsia="仿宋" w:cs="仿宋"/>
-          <w:sz w:val="24"/>
+          <w:sz w:val="21"/>
           <w:lang w:val="zh-CN"/>
         </w:rPr>
         <w:t>为准，乙方</w:t>
@@ -663,7 +667,7 @@
       <w:r>
         <w:rPr>
           <w:rFonts w:hint="eastAsia" w:ascii="仿宋" w:hAnsi="仿宋" w:eastAsia="仿宋" w:cs="仿宋"/>
-          <w:sz w:val="24"/>
+          <w:sz w:val="21"/>
           <w:lang w:val="en-US" w:eastAsia="zh-CN"/>
         </w:rPr>
         <w:t>若因此产生</w:t>
@@ -671,7 +675,7 @@
       <w:r>
         <w:rPr>
           <w:rFonts w:hint="eastAsia" w:ascii="仿宋" w:hAnsi="仿宋" w:eastAsia="仿宋" w:cs="仿宋"/>
-          <w:sz w:val="24"/>
+          <w:sz w:val="21"/>
           <w:lang w:val="zh-CN"/>
         </w:rPr>
         <w:t>备货、库存</w:t>
@@ -679,14 +683,14 @@
       <w:r>
         <w:rPr>
           <w:rFonts w:hint="eastAsia" w:ascii="仿宋" w:hAnsi="仿宋" w:eastAsia="仿宋" w:cs="仿宋"/>
-          <w:sz w:val="24"/>
+          <w:sz w:val="21"/>
         </w:rPr>
         <w:t>等</w:t>
       </w:r>
       <w:r>
         <w:rPr>
           <w:rFonts w:hint="eastAsia" w:ascii="仿宋" w:hAnsi="仿宋" w:eastAsia="仿宋" w:cs="仿宋"/>
-          <w:sz w:val="24"/>
+          <w:sz w:val="21"/>
           <w:lang w:val="zh-CN"/>
         </w:rPr>
         <w:t>情况与</w:t>
@@ -694,14 +698,14 @@
       <w:r>
         <w:rPr>
           <w:rFonts w:hint="eastAsia" w:ascii="仿宋" w:hAnsi="仿宋" w:eastAsia="仿宋" w:cs="仿宋"/>
-          <w:sz w:val="24"/>
+          <w:sz w:val="21"/>
         </w:rPr>
         <w:t>甲方无涉</w:t>
       </w:r>
       <w:r>
         <w:rPr>
           <w:rFonts w:hint="eastAsia" w:ascii="仿宋" w:hAnsi="仿宋" w:eastAsia="仿宋" w:cs="仿宋"/>
-          <w:sz w:val="24"/>
+          <w:sz w:val="21"/>
           <w:lang w:val="zh-CN"/>
         </w:rPr>
         <w:t>。</w:t>
@@ -727,7 +731,7 @@
       <w:r>
         <w:rPr>
           <w:rFonts w:hint="eastAsia" w:ascii="仿宋" w:hAnsi="仿宋" w:eastAsia="仿宋" w:cs="仿宋"/>
-          <w:sz w:val="24"/>
+          <w:sz w:val="21"/>
           <w:lang w:val="zh-CN"/>
         </w:rPr>
         <w:t>产品的价格以双方</w:t>
@@ -735,14 +739,14 @@
       <w:r>
         <w:rPr>
           <w:rFonts w:hint="eastAsia" w:ascii="仿宋" w:hAnsi="仿宋" w:eastAsia="仿宋" w:cs="仿宋"/>
-          <w:sz w:val="24"/>
+          <w:sz w:val="21"/>
         </w:rPr>
         <w:t>确定的年度协议价（附件二）</w:t>
       </w:r>
       <w:r>
         <w:rPr>
           <w:rFonts w:hint="eastAsia" w:ascii="仿宋" w:hAnsi="仿宋" w:eastAsia="仿宋" w:cs="仿宋"/>
-          <w:sz w:val="24"/>
+          <w:sz w:val="21"/>
           <w:lang w:val="zh-CN"/>
         </w:rPr>
         <w:t>为准，此采购协议价为年度固定价，</w:t>
@@ -750,7 +754,7 @@
       <w:r>
         <w:rPr>
           <w:rFonts w:hint="eastAsia" w:ascii="仿宋" w:hAnsi="仿宋" w:eastAsia="仿宋" w:cs="仿宋"/>
-          <w:sz w:val="24"/>
+          <w:sz w:val="21"/>
           <w:lang w:val="en-US" w:eastAsia="zh-CN"/>
         </w:rPr>
         <w:t>自本协议生效之日起</w:t>
@@ -758,7 +762,7 @@
       <w:r>
         <w:rPr>
           <w:rFonts w:hint="eastAsia" w:ascii="仿宋" w:hAnsi="仿宋" w:eastAsia="仿宋" w:cs="仿宋"/>
-          <w:sz w:val="24"/>
+          <w:sz w:val="21"/>
           <w:lang w:val="zh-CN"/>
         </w:rPr>
         <w:t>，除非甲乙双方书面同意，否则不能更改。</w:t>
@@ -784,7 +788,7 @@
       <w:r>
         <w:rPr>
           <w:rFonts w:hint="eastAsia" w:ascii="仿宋" w:hAnsi="仿宋" w:eastAsia="仿宋" w:cs="仿宋"/>
-          <w:sz w:val="24"/>
+          <w:sz w:val="21"/>
           <w:lang w:val="zh-CN"/>
         </w:rPr>
         <w:t>乙方向甲方</w:t>
@@ -792,14 +796,14 @@
       <w:r>
         <w:rPr>
           <w:rFonts w:hint="eastAsia" w:ascii="仿宋" w:hAnsi="仿宋" w:eastAsia="仿宋" w:cs="仿宋"/>
-          <w:sz w:val="24"/>
+          <w:sz w:val="21"/>
         </w:rPr>
         <w:t>提供</w:t>
       </w:r>
       <w:r>
         <w:rPr>
           <w:rFonts w:hint="eastAsia" w:ascii="仿宋" w:hAnsi="仿宋" w:eastAsia="仿宋" w:cs="仿宋"/>
-          <w:sz w:val="24"/>
+          <w:sz w:val="21"/>
           <w:lang w:val="zh-CN"/>
         </w:rPr>
         <w:t>货物</w:t>
@@ -807,14 +811,14 @@
       <w:r>
         <w:rPr>
           <w:rFonts w:hint="eastAsia" w:ascii="仿宋" w:hAnsi="仿宋" w:eastAsia="仿宋" w:cs="仿宋"/>
-          <w:sz w:val="24"/>
+          <w:sz w:val="21"/>
         </w:rPr>
         <w:t>的同时需履行</w:t>
       </w:r>
       <w:r>
         <w:rPr>
           <w:rFonts w:hint="eastAsia" w:ascii="仿宋" w:hAnsi="仿宋" w:eastAsia="仿宋" w:cs="仿宋"/>
-          <w:sz w:val="24"/>
+          <w:sz w:val="21"/>
           <w:lang w:val="zh-CN"/>
         </w:rPr>
         <w:t>以下</w:t>
@@ -822,14 +826,14 @@
       <w:r>
         <w:rPr>
           <w:rFonts w:hint="eastAsia" w:ascii="仿宋" w:hAnsi="仿宋" w:eastAsia="仿宋" w:cs="仿宋"/>
-          <w:sz w:val="24"/>
+          <w:sz w:val="21"/>
         </w:rPr>
         <w:t>义务</w:t>
       </w:r>
       <w:r>
         <w:rPr>
           <w:rFonts w:hint="eastAsia" w:ascii="仿宋" w:hAnsi="仿宋" w:eastAsia="仿宋" w:cs="仿宋"/>
-          <w:sz w:val="24"/>
+          <w:sz w:val="21"/>
           <w:lang w:val="zh-CN"/>
         </w:rPr>
         <w:t>：培训、安装、测试验收、质保期服务、质保期后服务等（如涉及）。</w:t>
@@ -854,7 +858,7 @@
       <w:r>
         <w:rPr>
           <w:rFonts w:hint="eastAsia" w:ascii="仿宋" w:hAnsi="仿宋" w:eastAsia="仿宋" w:cs="仿宋"/>
-          <w:sz w:val="24"/>
+          <w:sz w:val="21"/>
           <w:lang w:val="zh-CN"/>
         </w:rPr>
         <w:t>乙方必须按照《</w:t>
@@ -862,14 +866,14 @@
       <w:r>
         <w:rPr>
           <w:rFonts w:hint="eastAsia" w:ascii="仿宋" w:hAnsi="仿宋" w:eastAsia="仿宋" w:cs="仿宋"/>
-          <w:sz w:val="24"/>
+          <w:sz w:val="21"/>
         </w:rPr>
         <w:t>采购订单</w:t>
       </w:r>
       <w:r>
         <w:rPr>
           <w:rFonts w:hint="eastAsia" w:ascii="仿宋" w:hAnsi="仿宋" w:eastAsia="仿宋" w:cs="仿宋"/>
-          <w:sz w:val="24"/>
+          <w:sz w:val="21"/>
           <w:lang w:val="zh-CN"/>
         </w:rPr>
         <w:t>》向甲方提供规定货物，不得擅自更改货物的品牌、规格型号等。</w:t>
@@ -894,7 +898,7 @@
       <w:r>
         <w:rPr>
           <w:rFonts w:hint="eastAsia" w:ascii="仿宋" w:hAnsi="仿宋" w:eastAsia="仿宋" w:cs="仿宋"/>
-          <w:sz w:val="24"/>
+          <w:sz w:val="21"/>
         </w:rPr>
         <w:t>《采购订单》中的货物价格是乙方在规定的地点交货并且完全正确履行其他全部合同义务的价格，已包括将货物送至甲方指定地点产生或与之相关的所有费用，包括但不限于人工费、原材料费、设计费、制作加工费、仓储费、运输费、损耗费、保险费、装运费（至甲方指定地点）、管理费、利润、税金、风险费、培训费、技术指导费、维保费、政府部门检测相关费用等全部费用。</w:t>
       </w:r>
@@ -913,7 +917,7 @@
       <w:r>
         <w:rPr>
           <w:rFonts w:hint="eastAsia" w:ascii="仿宋" w:hAnsi="仿宋" w:eastAsia="仿宋" w:cs="仿宋"/>
-          <w:sz w:val="24"/>
+          <w:sz w:val="21"/>
         </w:rPr>
         <w:t xml:space="preserve">    若在货物采购过程中，相关增值税税率发生变化的，则货物价格中的不含税金额保持不变，增值税税率及税额相应调整。</w:t>
       </w:r>
@@ -938,7 +942,7 @@
       <w:r>
         <w:rPr>
           <w:rFonts w:hint="eastAsia" w:ascii="仿宋" w:hAnsi="仿宋" w:eastAsia="仿宋" w:cs="仿宋"/>
-          <w:sz w:val="24"/>
+          <w:sz w:val="21"/>
         </w:rPr>
         <w:t>乙方所能供应货物，甲方亦有权在其他供应商中进行比较采购。乙方承诺向甲方提供最优惠的具有竞争性的最低价格，</w:t>
       </w:r>
@@ -946,7 +950,7 @@
         <w:rPr>
           <w:rFonts w:hint="eastAsia" w:ascii="仿宋" w:hAnsi="仿宋" w:eastAsia="仿宋" w:cs="仿宋"/>
           <w:color w:val="FF0000"/>
-          <w:sz w:val="24"/>
+          <w:sz w:val="21"/>
         </w:rPr>
         <w:t>在同一时期及相似的供货量情况下，如果乙方以更低的价格供应其他客户或有其他供应商提供更低的价格</w:t>
       </w:r>
@@ -954,7 +958,7 @@
         <w:rPr>
           <w:rFonts w:hint="eastAsia" w:ascii="仿宋" w:hAnsi="仿宋" w:eastAsia="仿宋" w:cs="仿宋"/>
           <w:color w:val="FF0000"/>
-          <w:sz w:val="24"/>
+          <w:sz w:val="21"/>
           <w:lang w:val="en-US" w:eastAsia="zh-CN"/>
         </w:rPr>
         <w:t>时</w:t>
@@ -963,7 +967,7 @@
         <w:rPr>
           <w:rFonts w:hint="eastAsia" w:ascii="仿宋" w:hAnsi="仿宋" w:eastAsia="仿宋" w:cs="仿宋"/>
           <w:color w:val="FF0000"/>
-          <w:sz w:val="24"/>
+          <w:sz w:val="21"/>
         </w:rPr>
         <w:t>，则甲方有权</w:t>
       </w:r>
@@ -971,7 +975,7 @@
         <w:rPr>
           <w:rFonts w:hint="eastAsia" w:ascii="仿宋" w:hAnsi="仿宋" w:eastAsia="仿宋" w:cs="仿宋"/>
           <w:color w:val="FF0000"/>
-          <w:sz w:val="24"/>
+          <w:sz w:val="21"/>
           <w:lang w:val="en-US" w:eastAsia="zh-CN"/>
         </w:rPr>
         <w:t>要求乙方</w:t>
@@ -980,7 +984,7 @@
         <w:rPr>
           <w:rFonts w:hint="eastAsia" w:ascii="仿宋" w:hAnsi="仿宋" w:eastAsia="仿宋" w:cs="仿宋"/>
           <w:color w:val="FF0000"/>
-          <w:sz w:val="24"/>
+          <w:sz w:val="21"/>
         </w:rPr>
         <w:t>按照更低的价格最终结算，或单方解除本合同，向其他供方采购。</w:t>
       </w:r>
@@ -1003,7 +1007,7 @@
         <w:rPr>
           <w:rFonts w:hint="eastAsia" w:ascii="仿宋" w:hAnsi="仿宋" w:eastAsia="仿宋" w:cs="仿宋"/>
           <w:b/>
-          <w:sz w:val="24"/>
+          <w:sz w:val="21"/>
         </w:rPr>
         <w:t>采购订单</w:t>
       </w:r>
@@ -1027,7 +1031,7 @@
       <w:r>
         <w:rPr>
           <w:rFonts w:hint="eastAsia" w:ascii="仿宋" w:hAnsi="仿宋" w:eastAsia="仿宋" w:cs="仿宋"/>
-          <w:sz w:val="24"/>
+          <w:sz w:val="21"/>
         </w:rPr>
         <w:t>本合同生效后，甲方即可不定时向乙方发送《采购订单》进行采购，《采购订单》为本合同组成部分，与本合同正文具有同等法律效力。</w:t>
       </w:r>
@@ -1051,7 +1055,7 @@
       <w:r>
         <w:rPr>
           <w:rFonts w:hint="eastAsia" w:ascii="仿宋" w:hAnsi="仿宋" w:eastAsia="仿宋" w:cs="仿宋"/>
-          <w:sz w:val="24"/>
+          <w:sz w:val="21"/>
         </w:rPr>
         <w:t>乙方应在《采购订单》规定的时间内做出响应，以签字/盖章/邮件/电子信息等形式进行确认。若乙方未在规定时间内明确表示拒绝响应，该《采购订单》对乙方生效，乙方不能交货或迟延交货的，应承担违约责任。</w:t>
       </w:r>
@@ -1076,7 +1080,7 @@
       <w:r>
         <w:rPr>
           <w:rFonts w:hint="eastAsia" w:ascii="仿宋" w:hAnsi="仿宋" w:eastAsia="仿宋" w:cs="仿宋"/>
-          <w:sz w:val="24"/>
+          <w:sz w:val="21"/>
         </w:rPr>
         <w:t>无正当理由，乙方不得拒绝接受甲方的《采购订单》。若乙方拒绝履行甲方发出的《采购订单》，乙方应以书面形式说明理由，并根据甲方要求提供相应的证据材料，经甲方同意不视为违约，否则视为违约。</w:t>
       </w:r>
@@ -1098,7 +1102,7 @@
         <w:rPr>
           <w:rFonts w:hint="eastAsia" w:ascii="仿宋" w:hAnsi="仿宋" w:eastAsia="仿宋" w:cs="仿宋"/>
           <w:b/>
-          <w:sz w:val="24"/>
+          <w:sz w:val="21"/>
         </w:rPr>
         <w:t>合同期限</w:t>
       </w:r>
@@ -1113,6 +1117,10 @@
         </w:rPr>
       </w:pPr>
       <w:r>
+        <w:rPr>
+          <w:rFonts w:ascii="仿宋" w:hAnsi="仿宋" w:eastAsia="仿宋"/>
+          <w:sz w:val="21"/>
+        </w:rPr>
         <w:t>本合同有效期为期【{{r contractTermYears }}】年，自{{r contractStartDate }}起至{{r contractEndDate }}止，有效期届满前一个月，双方可以协商是否续签合同的相关事宜。</w:t>
       </w:r>
     </w:p>
@@ -1134,7 +1142,7 @@
         <w:rPr>
           <w:rFonts w:hint="eastAsia" w:ascii="仿宋" w:hAnsi="仿宋" w:eastAsia="仿宋" w:cs="仿宋"/>
           <w:b/>
-          <w:sz w:val="24"/>
+          <w:sz w:val="21"/>
         </w:rPr>
         <w:t>交货与运输</w:t>
       </w:r>
@@ -1158,7 +1166,7 @@
       <w:r>
         <w:rPr>
           <w:rFonts w:hint="eastAsia" w:ascii="仿宋" w:hAnsi="仿宋" w:eastAsia="仿宋" w:cs="仿宋"/>
-          <w:sz w:val="24"/>
+          <w:sz w:val="21"/>
         </w:rPr>
         <w:t>乙方应严格按照《采购订单》的内容履行交货义务。乙方在交货时，须提供送货单、货物合格证或质量检验报告、质量承诺书、相关质量证明文件以及合同要求提供的其他文件，如原产地证明，进口报关证明等凭证。送货单上须明确注明甲方货物编码、货物名称、品牌、型号、数量、单位等基础信息。</w:t>
       </w:r>
@@ -1180,6 +1188,10 @@
         </w:rPr>
       </w:pPr>
       <w:r>
+        <w:rPr>
+          <w:rFonts w:ascii="仿宋" w:hAnsi="仿宋" w:eastAsia="仿宋"/>
+          <w:sz w:val="21"/>
+        </w:rPr>
         <w:t>双方约定，乙方向甲方交付货物的常规货期为 【{{r deliveryDays }}】个工作日。若《采购订单》中指定的货期与常规货期不一致，以《采购订单》约定为准。</w:t>
       </w:r>
     </w:p>
@@ -1200,6 +1212,10 @@
         </w:rPr>
       </w:pPr>
       <w:r>
+        <w:rPr>
+          <w:rFonts w:ascii="仿宋" w:hAnsi="仿宋" w:eastAsia="仿宋"/>
+          <w:sz w:val="21"/>
+        </w:rPr>
         <w:t>双方确认，本合同项下的运输方式为 {{r transportMethod }} ，在发货【{{r shipmentNoticeHours }}】小时之前，乙方应将发货清单和装箱清单、货物运输公司、运输方式（如汽运/快递等）、运输车辆车牌、运输司机姓名及其联系方式、预计到货日期等书面告知甲方（如采用物流方式，乙方应在货物发出后立即将物流单号、预计到货时间等告知甲方）。乙方逾期通知或未通知造成甲方迟延接收货物的，甲方对此不承担责任。</w:t>
       </w:r>
     </w:p>
@@ -1222,7 +1238,7 @@
       <w:r>
         <w:rPr>
           <w:rFonts w:hint="eastAsia" w:ascii="仿宋" w:hAnsi="仿宋" w:eastAsia="仿宋" w:cs="仿宋"/>
-          <w:sz w:val="24"/>
+          <w:sz w:val="21"/>
         </w:rPr>
         <w:t>乙方如提前交货或部分交货的，应提前24小时向甲方提出书面申请并征得甲方书面同意，否则甲方有权拒收。</w:t>
       </w:r>
@@ -1246,7 +1262,7 @@
       <w:r>
         <w:rPr>
           <w:rFonts w:hint="eastAsia" w:ascii="仿宋" w:hAnsi="仿宋" w:eastAsia="仿宋" w:cs="仿宋"/>
-          <w:sz w:val="24"/>
+          <w:sz w:val="21"/>
         </w:rPr>
         <w:t>如果乙方预期将会发生交货延迟，应提前一周内通知甲方，同时详细说明理由，并提供相应的证明文件，乙方的通知不能免除其违约的责任。</w:t>
       </w:r>
@@ -1270,7 +1286,7 @@
       <w:r>
         <w:rPr>
           <w:rFonts w:hint="eastAsia" w:ascii="仿宋" w:hAnsi="仿宋" w:eastAsia="仿宋" w:cs="仿宋"/>
-          <w:sz w:val="24"/>
+          <w:sz w:val="21"/>
         </w:rPr>
         <w:t>当甲方要求乙方提前交货时，乙方应采取必要的措施满足交货要求，若确实无法满足，应在收到甲方提出的要求后24小时内以书面形式向甲方告知最早的交货时间和数量。</w:t>
       </w:r>
@@ -1294,7 +1310,7 @@
       <w:r>
         <w:rPr>
           <w:rFonts w:hint="eastAsia" w:ascii="仿宋" w:hAnsi="仿宋" w:eastAsia="仿宋" w:cs="仿宋"/>
-          <w:sz w:val="24"/>
+          <w:sz w:val="21"/>
         </w:rPr>
         <w:t>乙方应将货物运至甲方指定的交货地点交付给甲方，货物交付给甲方前产生的所有费用均由乙方承担，包括但不限于运输、包装，保险等相关费用；乙方的交货日期为甲方收货的日期，货物风险自甲方签收之日起转移。</w:t>
       </w:r>
@@ -1318,7 +1334,7 @@
       <w:r>
         <w:rPr>
           <w:rFonts w:hint="eastAsia" w:ascii="仿宋" w:hAnsi="仿宋" w:eastAsia="仿宋" w:cs="仿宋"/>
-          <w:sz w:val="24"/>
+          <w:sz w:val="21"/>
         </w:rPr>
         <w:t>乙方向甲方交货数量少于甲方《采购订单》数量，乙方应在限定期限内补足。</w:t>
       </w:r>
@@ -1342,7 +1358,7 @@
       <w:r>
         <w:rPr>
           <w:rFonts w:hint="eastAsia" w:ascii="仿宋" w:hAnsi="仿宋" w:eastAsia="仿宋" w:cs="仿宋"/>
-          <w:sz w:val="24"/>
+          <w:sz w:val="21"/>
         </w:rPr>
         <w:t>乙方为满足甲方需求，有义务根据甲方的需求计划预测，保持适量的安全库存,满足甲方的需求计划。</w:t>
       </w:r>
@@ -1365,7 +1381,7 @@
         <w:rPr>
           <w:rFonts w:hint="eastAsia" w:ascii="仿宋" w:hAnsi="仿宋" w:eastAsia="仿宋" w:cs="仿宋"/>
           <w:b/>
-          <w:sz w:val="24"/>
+          <w:sz w:val="21"/>
         </w:rPr>
         <w:t>质量标准及货物包装</w:t>
       </w:r>
@@ -1389,7 +1405,7 @@
       <w:r>
         <w:rPr>
           <w:rFonts w:hint="eastAsia" w:ascii="仿宋" w:hAnsi="仿宋" w:eastAsia="仿宋" w:cs="仿宋"/>
-          <w:sz w:val="24"/>
+          <w:sz w:val="21"/>
         </w:rPr>
         <w:t>质量标准：乙方向甲方供应的货物应符合：</w:t>
       </w:r>
@@ -1407,7 +1423,7 @@
       <w:r>
         <w:rPr>
           <w:rFonts w:hint="eastAsia" w:ascii="仿宋" w:hAnsi="仿宋" w:eastAsia="仿宋" w:cs="仿宋"/>
-          <w:sz w:val="24"/>
+          <w:sz w:val="21"/>
         </w:rPr>
         <w:t>☑国家标准；</w:t>
       </w:r>
@@ -1424,7 +1440,7 @@
       <w:r>
         <w:rPr>
           <w:rFonts w:hint="eastAsia" w:ascii="仿宋" w:hAnsi="仿宋" w:eastAsia="仿宋" w:cs="仿宋"/>
-          <w:sz w:val="24"/>
+          <w:sz w:val="21"/>
         </w:rPr>
         <w:t>☑行业标准；</w:t>
       </w:r>
@@ -1441,7 +1457,7 @@
       <w:r>
         <w:rPr>
           <w:rFonts w:hint="eastAsia" w:ascii="仿宋" w:hAnsi="仿宋" w:eastAsia="仿宋" w:cs="仿宋"/>
-          <w:sz w:val="24"/>
+          <w:sz w:val="21"/>
         </w:rPr>
         <w:t>☑双方确定的相关技术、质量标准。双方确定的相关技术、质量标准经双方签字盖章确认后亦为本合同内容，与本合同具有同等法律效力。</w:t>
       </w:r>
@@ -1458,7 +1474,7 @@
       <w:r>
         <w:rPr>
           <w:rFonts w:hint="eastAsia" w:ascii="仿宋" w:hAnsi="仿宋" w:eastAsia="仿宋" w:cs="仿宋"/>
-          <w:sz w:val="24"/>
+          <w:sz w:val="21"/>
         </w:rPr>
         <w:t>☑按样品交验。乙方如需要变更标准样品（包括但不限于材料、制造厂、产地、以及零件设计等），应于变更前一个月以书面形式向甲方提出书面申请，并同时将新的标准样品提供给甲方验证，经甲方书面确认后方可能变更。甲方亦可根据实际生产经营需要随时要求乙方变更标准样品，乙方无正当理由不得拒绝。</w:t>
       </w:r>
@@ -1474,7 +1490,7 @@
       <w:r>
         <w:rPr>
           <w:rFonts w:hint="eastAsia" w:ascii="仿宋" w:hAnsi="仿宋" w:eastAsia="仿宋" w:cs="仿宋"/>
-          <w:sz w:val="24"/>
+          <w:sz w:val="21"/>
         </w:rPr>
         <w:t>对同一项目的质量参数规定不一致时，验收时以较高质量标准为准。</w:t>
       </w:r>
@@ -1498,7 +1514,7 @@
       <w:r>
         <w:rPr>
           <w:rFonts w:hint="eastAsia" w:ascii="仿宋" w:hAnsi="仿宋" w:eastAsia="仿宋" w:cs="仿宋"/>
-          <w:sz w:val="24"/>
+          <w:sz w:val="21"/>
         </w:rPr>
         <w:t>货物包装：乙方货物包装应严格按照甲方所指定的包装标准和规定执行，国外项目要满足出口货物包装要求，甲方没有明确规定包装标准的，乙方应按照符合货物防漏、防潮、防震、防腐、防粗鲁搬运、能满足长途运输、足以保障货物安全及多次装卸之需要进行包装，并符合货物在购买、运输、销售、仓储、使用过程中所涉及的国家及地方政府主管部门对包装物颁布的包装标准及管制要求，包装物不计价、不回收。</w:t>
       </w:r>
@@ -1522,7 +1538,7 @@
       <w:r>
         <w:rPr>
           <w:rFonts w:hint="eastAsia" w:ascii="仿宋" w:hAnsi="仿宋" w:eastAsia="仿宋" w:cs="仿宋"/>
-          <w:sz w:val="24"/>
+          <w:sz w:val="21"/>
         </w:rPr>
         <w:t>乙方向甲方供应的货物应符合国家环保相关的法律法规及甲方环保、安全、卫生要求。如因货物因素对甲方或购买、使用甲方货物的第三方造成人身伤害或经济损失的由乙方承担全部责任。</w:t>
       </w:r>
@@ -1546,7 +1562,7 @@
       <w:r>
         <w:rPr>
           <w:rFonts w:hint="eastAsia" w:ascii="仿宋" w:hAnsi="仿宋" w:eastAsia="仿宋" w:cs="仿宋"/>
-          <w:sz w:val="24"/>
+          <w:sz w:val="21"/>
         </w:rPr>
         <w:t>乙方为甲方供应的货物必须符合国家强制性规定的要求，如甲方要求乙方提供相关零部件的国家或国际认证证书，乙方必须保持证书的有效性、证书和零部件的相符性。</w:t>
       </w:r>
@@ -1570,7 +1586,7 @@
       <w:r>
         <w:rPr>
           <w:rFonts w:hint="eastAsia" w:ascii="仿宋" w:hAnsi="仿宋" w:eastAsia="仿宋" w:cs="仿宋"/>
-          <w:sz w:val="24"/>
+          <w:sz w:val="21"/>
         </w:rPr>
         <w:t>甲方有权要求乙方按不同送货地点分开打包送货，乙方不得因此提出任何费用要求。</w:t>
       </w:r>
@@ -1594,7 +1610,7 @@
       <w:r>
         <w:rPr>
           <w:rFonts w:hint="eastAsia" w:ascii="仿宋" w:hAnsi="仿宋" w:eastAsia="仿宋" w:cs="仿宋"/>
-          <w:sz w:val="24"/>
+          <w:sz w:val="21"/>
         </w:rPr>
         <w:t>乙方应按照甲方要求，建立有效的质量保障体系，作为全面履约的一部分，质量保障体系包括使用可行的质量控制、检测手段和记录，以保证提供的货物是合格的，甲方有权随时对此进行检查考核。对于检测与考核不合格的，甲方有权立即终止已生效的合同并停止下单，直至乙方完成整改，达到甲方的要求为止；若连续两次整改不达标，甲方有权解除本合同。</w:t>
       </w:r>
@@ -1617,7 +1633,7 @@
         <w:rPr>
           <w:rFonts w:hint="eastAsia" w:ascii="仿宋" w:hAnsi="仿宋" w:eastAsia="仿宋" w:cs="仿宋"/>
           <w:b/>
-          <w:sz w:val="24"/>
+          <w:sz w:val="21"/>
         </w:rPr>
         <w:t>验收</w:t>
       </w:r>
@@ -1641,7 +1657,7 @@
       <w:r>
         <w:rPr>
           <w:rFonts w:hint="eastAsia" w:ascii="仿宋" w:hAnsi="仿宋" w:eastAsia="仿宋" w:cs="仿宋"/>
-          <w:sz w:val="24"/>
+          <w:sz w:val="21"/>
         </w:rPr>
         <w:t>交货准确：乙方每次交货的规格型号与数量或重量必须是100%准确，不允许送货品牌、规格型号、数量等信息与订单不一。</w:t>
       </w:r>
@@ -1665,7 +1681,7 @@
       <w:r>
         <w:rPr>
           <w:rFonts w:hint="eastAsia" w:ascii="仿宋" w:hAnsi="仿宋" w:eastAsia="仿宋" w:cs="仿宋"/>
-          <w:sz w:val="24"/>
+          <w:sz w:val="21"/>
         </w:rPr>
         <w:t>初步验收：货物运抵交货地点后，由甲方对（包括但不限于）收货数量是否相符、货物包装、外观、品牌、型号、规格及相关技术资料完整性等进行初步验收。乙方有样品封存于甲方的，验收时按样品（包括品牌、商标、规格、型号等）比照验收。若初步验收时发现货物数量、外观、品牌、规格、型号、提交的相关技术资料等不符合本合同之约定，乙方应在收到甲方异议之日起5日内补足或更换完成，并承担由于补、换所产生的全部费用。初步验收合格后，甲方指定签收人员将在《送货单》上签字，作为结算依据之一，《送货单》的签署仅表明甲方对该批货物的外观、数量、品牌、型号、规格等的验收，并不包括对隐蔽性的、通过外观检验所不能发现的任何质量或性能的验收，不排除乙方对货物质量的责任承担。</w:t>
       </w:r>
@@ -1689,7 +1705,7 @@
       <w:r>
         <w:rPr>
           <w:rFonts w:hint="eastAsia" w:ascii="仿宋" w:hAnsi="仿宋" w:eastAsia="仿宋" w:cs="仿宋"/>
-          <w:sz w:val="24"/>
+          <w:sz w:val="21"/>
         </w:rPr>
         <w:t>质量验收：甲方在收到乙方交付的货物后应依据第五条质量标准对货物进行检验，检验程序按照甲方品质管理部门规定的验收程序执行。如甲方发现货物存在质量、性能问题或不符合合同约定的，乙方应在甲方通知的合理期限内无偿予以补、换以及整改，并承担因此产生的一切费用，因此导致迟延交货、工程延误的，乙方应当承担合同约定的违约责任。乙方拒绝履行上述义务，或补换、整改后仍未解决问题的，甲方有权视问题严重程度采取折价支付、退换货乃至单方解除本合同。</w:t>
       </w:r>
@@ -1708,14 +1724,14 @@
           <w:rFonts w:hint="eastAsia" w:ascii="仿宋" w:hAnsi="仿宋" w:eastAsia="仿宋" w:cs="仿宋"/>
           <w:b/>
           <w:bCs/>
-          <w:sz w:val="24"/>
+          <w:sz w:val="21"/>
         </w:rPr>
         <w:t>退货：</w:t>
       </w:r>
       <w:r>
         <w:rPr>
           <w:rFonts w:hint="eastAsia" w:ascii="仿宋" w:hAnsi="仿宋" w:eastAsia="仿宋" w:cs="仿宋"/>
-          <w:sz w:val="24"/>
+          <w:sz w:val="21"/>
         </w:rPr>
         <w:t>如甲方选择退货，乙方应在甲方通知期限内办理退货手续，将不合格货物运离甲方库房，否则甲方有权利收取此产生的仓储费用，因退货产生的费用和造成的甲方损失由乙方承担。</w:t>
       </w:r>
@@ -1734,14 +1750,14 @@
           <w:rFonts w:hint="eastAsia" w:ascii="仿宋" w:hAnsi="仿宋" w:eastAsia="仿宋" w:cs="仿宋"/>
           <w:b/>
           <w:bCs/>
-          <w:sz w:val="24"/>
+          <w:sz w:val="21"/>
         </w:rPr>
         <w:t>换货：</w:t>
       </w:r>
       <w:r>
         <w:rPr>
           <w:rFonts w:hint="eastAsia" w:ascii="仿宋" w:hAnsi="仿宋" w:eastAsia="仿宋" w:cs="仿宋"/>
-          <w:sz w:val="24"/>
+          <w:sz w:val="21"/>
         </w:rPr>
         <w:t>乙方应在甲方通知期限内更换货物，乙方逾期处理的视为逾期交货，应承担逾期交货责任及和造成的甲方损失。</w:t>
       </w:r>
@@ -1760,14 +1776,14 @@
           <w:rFonts w:hint="eastAsia" w:ascii="仿宋" w:hAnsi="仿宋" w:eastAsia="仿宋" w:cs="仿宋"/>
           <w:b/>
           <w:bCs/>
-          <w:sz w:val="24"/>
+          <w:sz w:val="21"/>
         </w:rPr>
         <w:t>折价支付：</w:t>
       </w:r>
       <w:r>
         <w:rPr>
           <w:rFonts w:hint="eastAsia" w:ascii="仿宋" w:hAnsi="仿宋" w:eastAsia="仿宋" w:cs="仿宋"/>
-          <w:sz w:val="24"/>
+          <w:sz w:val="21"/>
         </w:rPr>
         <w:t>价格由双方另行协商，若协商不成，甲方有权选择退货或换货。</w:t>
       </w:r>
@@ -1791,7 +1807,7 @@
       <w:r>
         <w:rPr>
           <w:rFonts w:hint="eastAsia" w:ascii="仿宋" w:hAnsi="仿宋" w:eastAsia="仿宋" w:cs="仿宋"/>
-          <w:sz w:val="24"/>
+          <w:sz w:val="21"/>
         </w:rPr>
         <w:t>质量验收为抽检，检验结果仅对当次交验品有效，并不代表乙方交付的整批货物的全部满足质量标准，因此，若甲方在生产和销售过程中发现乙方货物存在质量问题，甲方仍有权要求乙方承担质量担保责任。</w:t>
       </w:r>
@@ -1815,7 +1831,7 @@
       <w:r>
         <w:rPr>
           <w:rFonts w:hint="eastAsia" w:ascii="仿宋" w:hAnsi="仿宋" w:eastAsia="仿宋" w:cs="仿宋"/>
-          <w:sz w:val="24"/>
+          <w:sz w:val="21"/>
         </w:rPr>
         <w:t>质量争议的解决：若乙方不认可甲方出具的检验报告，双方可协商委托第三方质量检测机构对质量有争议的货物进行检测，若双方无法就第三方质量检测机构的指定达成共识，则由甲方决定第三方质量检测机构，该第三方质量检测机构出具的检测参数为最终检测结果，甲乙双方均应认可。若根据第三方检测机构出具的检测数据判定货物为不合格，由此生产的检测费、运费等由乙方承担，乙方同时还应根据合同约定承担其他责任；若根据第三方检测机构出具的检测报告判定货物为合格，由此产生的检测费、运费等由甲方承担。</w:t>
       </w:r>
@@ -1838,7 +1854,7 @@
         <w:rPr>
           <w:rFonts w:hint="eastAsia" w:ascii="仿宋" w:hAnsi="仿宋" w:eastAsia="仿宋" w:cs="仿宋"/>
           <w:b/>
-          <w:sz w:val="24"/>
+          <w:sz w:val="21"/>
         </w:rPr>
         <w:t>结算方式及条件</w:t>
       </w:r>
@@ -1862,7 +1878,7 @@
       <w:r>
         <w:rPr>
           <w:rFonts w:hint="eastAsia" w:ascii="仿宋" w:hAnsi="仿宋" w:eastAsia="仿宋" w:cs="仿宋"/>
-          <w:sz w:val="24"/>
+          <w:sz w:val="21"/>
         </w:rPr>
         <w:t>货款结算</w:t>
       </w:r>
@@ -1881,6 +1897,10 @@
         </w:rPr>
       </w:pPr>
       <w:r>
+        <w:rPr>
+          <w:rFonts w:ascii="仿宋" w:hAnsi="仿宋" w:eastAsia="仿宋"/>
+          <w:sz w:val="21"/>
+        </w:rPr>
         <w:t>结算周期：{{r settlementCycle }}。乙方提供甲方指定接收人员签署的《送货单》等资料作为结算依据，经甲方对账后书面确认结算。乙方在甲方付款前3个工作日内应向甲方开具经双方确认的货款金额的增值税专用发票，否则甲方有权拒绝付款。</w:t>
       </w:r>
     </w:p>
@@ -1900,7 +1920,7 @@
       <w:r>
         <w:rPr>
           <w:rFonts w:hint="eastAsia" w:ascii="仿宋" w:hAnsi="仿宋" w:eastAsia="仿宋" w:cs="仿宋"/>
-          <w:sz w:val="24"/>
+          <w:sz w:val="21"/>
         </w:rPr>
         <w:t>结算方式：甲方通过 ☑承兑 ☑转账 □现金方式支付。</w:t>
       </w:r>
@@ -1924,7 +1944,7 @@
       <w:r>
         <w:rPr>
           <w:rFonts w:hint="eastAsia" w:ascii="仿宋" w:hAnsi="仿宋" w:eastAsia="仿宋" w:cs="仿宋"/>
-          <w:sz w:val="24"/>
+          <w:sz w:val="21"/>
         </w:rPr>
         <w:t>乙方须向甲方提供其准确名称和银行账户、账号等信息。如乙方名称和银行信息发生变更，应在变更之日书面通知甲方；如乙方名称和银行信息等发生变更而乙方未向甲方发送变更通知导致乙方未收到甲方支付的货款的， 因此造成的损失由乙方自行承担。</w:t>
       </w:r>
@@ -1941,7 +1961,7 @@
       <w:r>
         <w:rPr>
           <w:rFonts w:hint="eastAsia" w:ascii="仿宋" w:hAnsi="仿宋" w:eastAsia="仿宋" w:cs="仿宋"/>
-          <w:sz w:val="24"/>
+          <w:sz w:val="21"/>
         </w:rPr>
         <w:t>乙方变更以上信息，甲方有权相应顺延合同货物的付款期限至下一个付款周期，若乙方变更信息涉及发票记载事项，甲方有权退回增值税专用发票，乙方必须根据变更后的信息重新开具发票，该发票金额对应的货款付款期限自甲方收到乙方重新开具合适发票后重新计算。</w:t>
       </w:r>
@@ -1965,7 +1985,7 @@
       <w:r>
         <w:rPr>
           <w:rFonts w:hint="eastAsia" w:ascii="仿宋" w:hAnsi="仿宋" w:eastAsia="仿宋" w:cs="仿宋"/>
-          <w:sz w:val="24"/>
+          <w:sz w:val="21"/>
         </w:rPr>
         <w:t>甲方有权拒付供货质量有缺陷或供货数量不足部分的合同货物的价款。</w:t>
       </w:r>
@@ -1991,7 +2011,7 @@
         <w:rPr>
           <w:rFonts w:hint="eastAsia" w:ascii="仿宋" w:hAnsi="仿宋" w:eastAsia="仿宋" w:cs="仿宋"/>
           <w:color w:val="FF0000"/>
-          <w:sz w:val="24"/>
+          <w:sz w:val="21"/>
         </w:rPr>
         <w:t>如果供应商对我司的产品、技术方案、工艺等有优化意见，可节省采购成本、安装成本、或者提高质量等。供应商提供方案报告，经我司技术论证有可行性，能够在下次的应付账款支付时享受提前15天支付。</w:t>
       </w:r>
@@ -2015,7 +2035,7 @@
       <w:r>
         <w:rPr>
           <w:rFonts w:hint="eastAsia" w:ascii="仿宋" w:hAnsi="仿宋" w:eastAsia="仿宋" w:cs="仿宋"/>
-          <w:sz w:val="24"/>
+          <w:sz w:val="21"/>
         </w:rPr>
         <w:t>乙方出现违约事项，或者双方对于违约事项存在争议，尚未达成一致的解决意见之前，甲方有权单方中止向乙方支付货款。</w:t>
       </w:r>
@@ -2038,7 +2058,7 @@
         <w:rPr>
           <w:rFonts w:hint="eastAsia" w:ascii="仿宋" w:hAnsi="仿宋" w:eastAsia="仿宋" w:cs="仿宋"/>
           <w:b/>
-          <w:sz w:val="24"/>
+          <w:sz w:val="21"/>
         </w:rPr>
         <w:t>质量保证期和保证金</w:t>
       </w:r>
@@ -2062,14 +2082,14 @@
       <w:r>
         <w:rPr>
           <w:rFonts w:hint="eastAsia" w:ascii="仿宋" w:hAnsi="仿宋" w:eastAsia="仿宋" w:cs="仿宋"/>
-          <w:sz w:val="24"/>
+          <w:sz w:val="21"/>
         </w:rPr>
         <w:t>乙方所供物品，必须按照国家、行业或企业有关标准和规范生产，甲方如有特殊要求，还须符合甲方提出的质量要求或图纸设计。乙方保证合同项下提供的全部货物必须是全新的并且没有设计、材料及工艺上的缺陷，完全符合合同规定的品牌、质量、规格和性能的要求和符合质量标准，并有产品的质量证明书。</w:t>
       </w:r>
       <w:r>
         <w:rPr>
           <w:rFonts w:hint="eastAsia" w:ascii="仿宋" w:hAnsi="仿宋" w:eastAsia="仿宋" w:cs="仿宋"/>
-          <w:sz w:val="24"/>
+          <w:sz w:val="21"/>
           <w:lang w:val="zh-CN"/>
         </w:rPr>
         <w:t>在正常操作条件下，合同项下乙方所提供的货物不会因为任何潜在缺陷发生安全事故。若由于货物的潜在缺陷而导致安全事故，造成的所有甲方损失应由乙方赔偿。</w:t>
@@ -2094,14 +2114,14 @@
       <w:r>
         <w:rPr>
           <w:rFonts w:hint="eastAsia" w:ascii="仿宋" w:hAnsi="仿宋" w:eastAsia="仿宋" w:cs="仿宋"/>
-          <w:sz w:val="24"/>
+          <w:sz w:val="21"/>
         </w:rPr>
         <w:t xml:space="preserve">质量保证期：对于甲方订购的每批货物，乙方提供的该批货物质保期为    </w:t>
       </w:r>
       <w:r>
         <w:rPr>
           <w:rFonts w:hint="eastAsia" w:ascii="仿宋" w:hAnsi="仿宋" w:eastAsia="仿宋" w:cs="仿宋"/>
-          <w:sz w:val="24"/>
+          <w:sz w:val="21"/>
           <w:u w:val="single"/>
         </w:rPr>
         <w:t xml:space="preserve">    </w:t>
@@ -2109,14 +2129,14 @@
       <w:r>
         <w:rPr>
           <w:rFonts w:hint="eastAsia" w:ascii="仿宋" w:hAnsi="仿宋" w:eastAsia="仿宋" w:cs="仿宋"/>
-          <w:sz w:val="24"/>
+          <w:sz w:val="21"/>
         </w:rPr>
         <w:t>从该批物品甲方验收合格之日算起</w:t>
       </w:r>
       <w:r>
         <w:rPr>
           <w:rFonts w:hint="eastAsia" w:ascii="仿宋" w:hAnsi="仿宋" w:eastAsia="仿宋" w:cs="仿宋"/>
-          <w:sz w:val="24"/>
+          <w:sz w:val="21"/>
           <w:u w:val="single"/>
         </w:rPr>
         <w:t>12个月或货到现场18个月（以后到期为准）</w:t>
@@ -2124,7 +2144,7 @@
       <w:r>
         <w:rPr>
           <w:rFonts w:hint="eastAsia" w:ascii="仿宋" w:hAnsi="仿宋" w:eastAsia="仿宋" w:cs="仿宋"/>
-          <w:sz w:val="24"/>
+          <w:sz w:val="21"/>
         </w:rPr>
         <w:t>。若货物在质保期内需要更换或更新，从双方认可的修复完成日开始，质保期按修复验收后重新算起。</w:t>
       </w:r>
@@ -2148,14 +2168,14 @@
       <w:r>
         <w:rPr>
           <w:rFonts w:hint="eastAsia" w:ascii="仿宋" w:hAnsi="仿宋" w:eastAsia="仿宋" w:cs="仿宋"/>
-          <w:sz w:val="24"/>
+          <w:sz w:val="21"/>
         </w:rPr>
         <w:t>本合同生效后，乙方应向甲方缴纳</w:t>
       </w:r>
       <w:r>
         <w:rPr>
           <w:rFonts w:hint="eastAsia" w:ascii="仿宋" w:hAnsi="仿宋" w:eastAsia="仿宋" w:cs="仿宋"/>
-          <w:sz w:val="24"/>
+          <w:sz w:val="21"/>
           <w:u w:val="single"/>
         </w:rPr>
         <w:t xml:space="preserve">  10  </w:t>
@@ -2163,14 +2183,14 @@
       <w:r>
         <w:rPr>
           <w:rFonts w:hint="eastAsia" w:ascii="仿宋" w:hAnsi="仿宋" w:eastAsia="仿宋" w:cs="仿宋"/>
-          <w:sz w:val="24"/>
+          <w:sz w:val="21"/>
         </w:rPr>
         <w:t>万元（大写：人民币</w:t>
       </w:r>
       <w:r>
         <w:rPr>
           <w:rFonts w:hint="eastAsia" w:ascii="仿宋" w:hAnsi="仿宋" w:eastAsia="仿宋" w:cs="仿宋"/>
-          <w:sz w:val="24"/>
+          <w:sz w:val="21"/>
           <w:u w:val="single"/>
         </w:rPr>
         <w:t>壹拾万元整</w:t>
@@ -2178,7 +2198,7 @@
       <w:r>
         <w:rPr>
           <w:rFonts w:hint="eastAsia" w:ascii="仿宋" w:hAnsi="仿宋" w:eastAsia="仿宋" w:cs="仿宋"/>
-          <w:sz w:val="24"/>
+          <w:sz w:val="21"/>
         </w:rPr>
         <w:t>）作为保证金，若乙方交付的货物不符合质量标准或乙方存在其他违约行为的应承担责任的，甲方可从货款中扣除，若货款不足以扣除的，从乙方缴纳的质量保证金中扣除相应金额。乙方采取以下方式缴纳保证金：</w:t>
       </w:r>
@@ -2195,14 +2215,14 @@
       <w:r>
         <w:rPr>
           <w:rFonts w:hint="eastAsia" w:ascii="仿宋" w:hAnsi="仿宋" w:eastAsia="仿宋" w:cs="仿宋"/>
-          <w:sz w:val="24"/>
+          <w:sz w:val="21"/>
         </w:rPr>
         <w:t>☑本合同签订之日起</w:t>
       </w:r>
       <w:r>
         <w:rPr>
           <w:rFonts w:hint="eastAsia" w:ascii="仿宋" w:hAnsi="仿宋" w:eastAsia="仿宋" w:cs="仿宋"/>
-          <w:sz w:val="24"/>
+          <w:sz w:val="21"/>
           <w:u w:val="single"/>
         </w:rPr>
         <w:t xml:space="preserve">     </w:t>
@@ -2210,7 +2230,7 @@
       <w:r>
         <w:rPr>
           <w:rFonts w:hint="eastAsia" w:ascii="仿宋" w:hAnsi="仿宋" w:eastAsia="仿宋" w:cs="仿宋"/>
-          <w:sz w:val="24"/>
+          <w:sz w:val="21"/>
         </w:rPr>
         <w:t>个工作日内，乙方以现金方式缴纳。</w:t>
       </w:r>
@@ -2227,7 +2247,7 @@
       <w:r>
         <w:rPr>
           <w:rFonts w:hint="eastAsia" w:ascii="仿宋" w:hAnsi="仿宋" w:eastAsia="仿宋" w:cs="仿宋"/>
-          <w:sz w:val="24"/>
+          <w:sz w:val="21"/>
         </w:rPr>
         <w:t>□从甲方应付乙方货款中扣除，首次应付货款不足扣除的，在后期应付货款中扣除，直至扣足约定保证金金额为止。</w:t>
       </w:r>
@@ -2251,7 +2271,7 @@
       <w:r>
         <w:rPr>
           <w:rFonts w:hint="eastAsia" w:ascii="仿宋" w:hAnsi="仿宋" w:eastAsia="仿宋" w:cs="仿宋"/>
-          <w:sz w:val="24"/>
+          <w:sz w:val="21"/>
         </w:rPr>
         <w:t>保证金的退还：乙方向甲方供应最后一批货物质量保证期满，甲乙双方在本合同项下没有任何纠纷或纠纷已经协商解决的，甲方无息退还乙方保证金。</w:t>
       </w:r>
@@ -2274,7 +2294,7 @@
         <w:rPr>
           <w:rFonts w:hint="eastAsia" w:ascii="仿宋" w:hAnsi="仿宋" w:eastAsia="仿宋" w:cs="仿宋"/>
           <w:b/>
-          <w:sz w:val="24"/>
+          <w:sz w:val="21"/>
         </w:rPr>
         <w:t>知识产权</w:t>
       </w:r>
@@ -2298,7 +2318,7 @@
       <w:r>
         <w:rPr>
           <w:rFonts w:hint="eastAsia" w:ascii="仿宋" w:hAnsi="仿宋" w:eastAsia="仿宋" w:cs="仿宋"/>
-          <w:sz w:val="24"/>
+          <w:sz w:val="21"/>
         </w:rPr>
         <w:t>乙方提供的货物或服务，使用第三人专利，专有技术、技术秘密、商业秘密、著作权、商标权等知识产权的，在签订合同时，应向甲方说明知识产权的权利人、名称等权利状况，相应知识产权使用费由乙方负责支付。</w:t>
       </w:r>
@@ -2322,7 +2342,7 @@
       <w:r>
         <w:rPr>
           <w:rFonts w:hint="eastAsia" w:ascii="仿宋" w:hAnsi="仿宋" w:eastAsia="仿宋" w:cs="仿宋"/>
-          <w:sz w:val="24"/>
+          <w:sz w:val="21"/>
         </w:rPr>
         <w:t xml:space="preserve">乙方提供的货物或服务侵犯了第三人专利，技术秘密、商业秘密、著作权、商标权等知识产权的，由乙方承担全部法律责任和经济赔偿责任，同时还需赔偿造成的甲方损失。 </w:t>
       </w:r>
@@ -2346,7 +2366,7 @@
       <w:r>
         <w:rPr>
           <w:rFonts w:hint="eastAsia" w:ascii="仿宋" w:hAnsi="仿宋" w:eastAsia="仿宋" w:cs="仿宋"/>
-          <w:sz w:val="24"/>
+          <w:sz w:val="21"/>
         </w:rPr>
         <w:t>如合同货物系乙方按照甲方的要求、甲方提供的技术资料和/或图纸所产生的部件，则乙方只能将此合同货物出售给甲方。乙方不能将相关货物提供其他任何第三方使用，且不能将按第11条约定归属于甲方的知识产权、非专利技术成果等提供或许可给任何第三方使用，违反此项约定，甲方有权要求乙方承担以下一项或者多项法律责任：（1）立即停止向第三方出售合同货物的行为；（2）向甲方支付违约金，违约金的金额为乙方向第三方出售此项货物所获取利润的2倍；（3）赔偿甲方因乙方和第三方知识产权侵权导致的直接和间接损失。</w:t>
       </w:r>
@@ -2371,7 +2391,7 @@
           <w:rFonts w:hint="eastAsia" w:ascii="仿宋" w:hAnsi="仿宋" w:eastAsia="仿宋" w:cs="仿宋"/>
           <w:b/>
           <w:bCs/>
-          <w:sz w:val="24"/>
+          <w:sz w:val="21"/>
         </w:rPr>
         <w:t>违约责任</w:t>
       </w:r>
@@ -2395,14 +2415,14 @@
       <w:r>
         <w:rPr>
           <w:rFonts w:hint="eastAsia" w:ascii="仿宋" w:hAnsi="仿宋" w:eastAsia="仿宋" w:cs="仿宋"/>
-          <w:sz w:val="24"/>
+          <w:sz w:val="21"/>
         </w:rPr>
         <w:t>乙方如逾期交货，应按逾期交货金额的</w:t>
       </w:r>
       <w:r>
         <w:rPr>
           <w:rFonts w:hint="eastAsia" w:ascii="仿宋" w:hAnsi="仿宋" w:eastAsia="仿宋" w:cs="仿宋"/>
-          <w:sz w:val="24"/>
+          <w:sz w:val="21"/>
           <w:u w:val="single"/>
         </w:rPr>
         <w:t xml:space="preserve">  0.5 </w:t>
@@ -2410,7 +2430,7 @@
       <w:r>
         <w:rPr>
           <w:rFonts w:hint="eastAsia" w:ascii="仿宋" w:hAnsi="仿宋" w:eastAsia="仿宋" w:cs="仿宋"/>
-          <w:sz w:val="24"/>
+          <w:sz w:val="21"/>
         </w:rPr>
         <w:t>%/天向甲方支付违约金；乙方未按本合同约定在限定期限内补足或换货的，少交部分或换货部分按前述违约金标准的双倍承担逾期交货违约责任。逾期交货时间超过3日，甲方有权取消该《采购订单》，甲方取消订单的，乙方仍应承担该订单总金额20%的违约金。前述违约金不足以弥补甲方损失的，乙方还应赔偿因违约给甲方造成的损失。</w:t>
       </w:r>
@@ -2434,7 +2454,7 @@
       <w:r>
         <w:rPr>
           <w:rFonts w:hint="eastAsia" w:ascii="仿宋" w:hAnsi="仿宋" w:eastAsia="仿宋" w:cs="仿宋"/>
-          <w:sz w:val="24"/>
+          <w:sz w:val="21"/>
         </w:rPr>
         <w:t xml:space="preserve">除本合同另有约定外，乙方出现违约行为，甲方书面通知整改后7日内仍不进行整改的，甲方有权解除本合同。因乙方违约导致合同解除的，乙方应向甲方支付本合同下年度采购订单总金额的10%作为违约金，违约金不足以弥补甲方损失的，乙方应另行承担赔偿责任。 </w:t>
       </w:r>
@@ -2458,7 +2478,7 @@
       <w:r>
         <w:rPr>
           <w:rFonts w:hint="eastAsia" w:ascii="仿宋" w:hAnsi="仿宋" w:eastAsia="仿宋" w:cs="仿宋"/>
-          <w:sz w:val="24"/>
+          <w:sz w:val="21"/>
         </w:rPr>
         <w:t>由于乙方提供的货物所存在的质量问题（包括不限于缺陷、瑕疵等）导致第三人在使用甲方货物时受到人身、财产损害的，若甲方因此而需向他人承担赔偿，则乙方应赔偿造成的甲方损失。</w:t>
       </w:r>
@@ -2482,7 +2502,7 @@
       <w:r>
         <w:rPr>
           <w:rFonts w:hint="eastAsia" w:ascii="仿宋" w:hAnsi="仿宋" w:eastAsia="仿宋" w:cs="仿宋"/>
-          <w:sz w:val="24"/>
+          <w:sz w:val="21"/>
         </w:rPr>
         <w:t>概括性违约：虽然本合同没有明确约定，但是乙方的行为损害甲方的利益，经甲方提出仍不整改，或者未达到甲方的整改要求，则为概括性违约。出现概括性违约的情形，甲方保留中止付款、要求赔偿、追究法律责任、解除合同等权利。</w:t>
       </w:r>
@@ -2506,7 +2526,7 @@
       <w:r>
         <w:rPr>
           <w:rFonts w:hint="eastAsia" w:ascii="仿宋" w:hAnsi="仿宋" w:eastAsia="仿宋" w:cs="仿宋"/>
-          <w:sz w:val="24"/>
+          <w:sz w:val="21"/>
         </w:rPr>
         <w:t>乙方因质量、数量或违反本合同其他约定等原因应向甲方支付的违约金、赔偿金等，甲方均有权在应付货款或者保证金中扣除，但甲方应书面告知乙方扣款的原因及金额。保证金因上述原因被甲方扣减的，乙方应在收到甲方通知之日起5日内补齐差额，否则甲方可以从应支付的货款中直接扣除补齐保证金，并有权解除合同。</w:t>
       </w:r>
@@ -2530,7 +2550,7 @@
           <w:rFonts w:hint="eastAsia" w:ascii="仿宋" w:hAnsi="仿宋" w:eastAsia="仿宋" w:cs="仿宋"/>
           <w:b/>
           <w:bCs/>
-          <w:sz w:val="24"/>
+          <w:sz w:val="21"/>
         </w:rPr>
         <w:t>保密</w:t>
       </w:r>
@@ -2551,7 +2571,7 @@
       <w:r>
         <w:rPr>
           <w:rFonts w:hint="eastAsia" w:ascii="仿宋" w:hAnsi="仿宋" w:eastAsia="仿宋" w:cs="仿宋"/>
-          <w:sz w:val="24"/>
+          <w:sz w:val="21"/>
           <w:szCs w:val="24"/>
         </w:rPr>
         <w:t>乙方对因履行本合同获取的甲方未予公开的信息，以及本合同所涉相关信息，包括但不限于合同主体商业活动、产品、技术细节及性能、价格等负有保密义务，在未得到甲方同意时不得向任何第三方披露，且不得用于履行本合同以外其他目的，乙方的保密义务不因本合同终止而免除。如乙方违反保密义务，甲方有权要求乙方支付违约金，违约金按照以下金额较高者确定：（1）甲方因乙方违反保密义务受到的损失；（2）乙方因违反保密义务所获得的利益，包括但不限于因使用或披露保密信息而获得的经济利益、竞争优势等；（3）年度采购额总金额的30%。</w:t>
@@ -2577,7 +2597,7 @@
           <w:rFonts w:hint="eastAsia" w:ascii="仿宋" w:hAnsi="仿宋" w:eastAsia="仿宋" w:cs="仿宋"/>
           <w:b/>
           <w:bCs/>
-          <w:sz w:val="24"/>
+          <w:sz w:val="21"/>
         </w:rPr>
         <w:t>不可抗力</w:t>
       </w:r>
@@ -2602,7 +2622,7 @@
       <w:r>
         <w:rPr>
           <w:rFonts w:hint="eastAsia" w:ascii="仿宋" w:hAnsi="仿宋" w:eastAsia="仿宋" w:cs="仿宋"/>
-          <w:sz w:val="24"/>
+          <w:sz w:val="21"/>
           <w:lang w:val="zh-CN"/>
         </w:rPr>
         <w:t>凡因自然灾害、政府行为、行业环境重大变化等不可抗力导致一方不能依合同履行其义务时，双方均不负违约责任，但必须及时告知另一方，且在不可抗力事件发生后7日内提供不可抗力事件有关证明。</w:t>
@@ -2628,7 +2648,7 @@
       <w:r>
         <w:rPr>
           <w:rFonts w:hint="eastAsia" w:ascii="仿宋" w:hAnsi="仿宋" w:eastAsia="仿宋" w:cs="仿宋"/>
-          <w:sz w:val="24"/>
+          <w:sz w:val="21"/>
           <w:lang w:val="zh-CN"/>
         </w:rPr>
         <w:t>如当事人一方在迟延履行后发生不可抗力的，不能免除其违约责任。</w:t>
@@ -2653,7 +2673,7 @@
       <w:r>
         <w:rPr>
           <w:rFonts w:hint="eastAsia" w:ascii="仿宋" w:hAnsi="仿宋" w:eastAsia="仿宋" w:cs="仿宋"/>
-          <w:sz w:val="24"/>
+          <w:sz w:val="21"/>
           <w:lang w:val="zh-CN"/>
         </w:rPr>
         <w:t>如果不可抗力事件造成迟延发货超过30日，甲方有权解除本合同且无需承担违约责任。</w:t>
@@ -2678,7 +2698,7 @@
         <w:rPr>
           <w:rFonts w:hint="eastAsia" w:ascii="仿宋" w:hAnsi="仿宋" w:eastAsia="仿宋" w:cs="仿宋"/>
           <w:b/>
-          <w:sz w:val="24"/>
+          <w:sz w:val="21"/>
         </w:rPr>
         <w:t>合同</w:t>
       </w:r>
@@ -2687,7 +2707,7 @@
           <w:rFonts w:hint="eastAsia" w:ascii="仿宋" w:hAnsi="仿宋" w:eastAsia="仿宋" w:cs="仿宋"/>
           <w:b/>
           <w:bCs/>
-          <w:sz w:val="24"/>
+          <w:sz w:val="21"/>
         </w:rPr>
         <w:t xml:space="preserve">解除  </w:t>
       </w:r>
@@ -2711,7 +2731,7 @@
       <w:r>
         <w:rPr>
           <w:rFonts w:hint="eastAsia" w:ascii="仿宋" w:hAnsi="仿宋" w:eastAsia="仿宋" w:cs="仿宋"/>
-          <w:sz w:val="24"/>
+          <w:sz w:val="21"/>
         </w:rPr>
         <w:t xml:space="preserve">本合同另有约定外，在合同有效期内，如乙方的质量、交货期限、技术、价格等指标无法满足或保证甲方合格供方的条件或者乙方有严重违反本合同约定的情况时，甲方有权随时取消乙方合格供应商的资格、解除本合同、拒绝接收乙方的任何货物。  </w:t>
       </w:r>
@@ -2735,7 +2755,7 @@
       <w:r>
         <w:rPr>
           <w:rFonts w:hint="eastAsia" w:ascii="仿宋" w:hAnsi="仿宋" w:eastAsia="仿宋" w:cs="仿宋"/>
-          <w:sz w:val="24"/>
+          <w:sz w:val="21"/>
         </w:rPr>
         <w:t xml:space="preserve">在本合同有效期内，乙方若需解除本合同，则应至少提前90日向甲方发出提前终止合同的书面通知书，通知中应载明乙方要求终止合同的详细理由、乙方计划终止合同的日期等事项。乙方终止本合同的通知应经甲方书面同意，并由双方签订《终止合同》，否则，乙方应继续履行本合同。  </w:t>
       </w:r>
@@ -2761,7 +2781,7 @@
         <w:rPr>
           <w:rFonts w:hint="eastAsia" w:ascii="仿宋" w:hAnsi="仿宋" w:eastAsia="仿宋" w:cs="仿宋"/>
           <w:b/>
-          <w:sz w:val="24"/>
+          <w:sz w:val="21"/>
         </w:rPr>
         <w:t>通知与送达</w:t>
       </w:r>
@@ -2785,7 +2805,7 @@
       <w:r>
         <w:rPr>
           <w:rFonts w:hint="eastAsia" w:ascii="仿宋" w:hAnsi="仿宋" w:eastAsia="仿宋" w:cs="仿宋"/>
-          <w:sz w:val="24"/>
+          <w:sz w:val="21"/>
         </w:rPr>
         <w:t>为使本合同得以顺利履行，乙方指定以下联络方式：</w:t>
       </w:r>
@@ -2802,7 +2822,7 @@
       <w:r>
         <w:rPr>
           <w:rFonts w:hint="eastAsia" w:ascii="仿宋" w:hAnsi="仿宋" w:eastAsia="仿宋" w:cs="仿宋"/>
-          <w:sz w:val="24"/>
+          <w:sz w:val="21"/>
         </w:rPr>
         <w:t>联络人：{{r supplierRepresentativeName }}</w:t>
         <w:tab/>
@@ -2813,83 +2833,83 @@
       <w:r>
         <w:rPr>
           <w:rFonts w:hint="eastAsia" w:ascii="仿宋" w:hAnsi="仿宋" w:eastAsia="仿宋" w:cs="仿宋"/>
-          <w:sz w:val="24"/>
+          <w:sz w:val="21"/>
           <w:u w:val="single"/>
         </w:rPr>
       </w:r>
       <w:r>
         <w:rPr>
           <w:rFonts w:hint="eastAsia" w:ascii="仿宋" w:hAnsi="仿宋" w:eastAsia="仿宋" w:cs="仿宋"/>
-          <w:sz w:val="24"/>
+          <w:sz w:val="21"/>
           <w:u w:val="single"/>
         </w:rPr>
       </w:r>
       <w:r>
         <w:rPr>
           <w:rFonts w:hint="eastAsia" w:ascii="仿宋" w:hAnsi="仿宋" w:eastAsia="仿宋" w:cs="仿宋"/>
-          <w:sz w:val="24"/>
+          <w:sz w:val="21"/>
           <w:u w:val="single"/>
         </w:rPr>
       </w:r>
       <w:r>
         <w:rPr>
           <w:rFonts w:hint="eastAsia" w:ascii="仿宋" w:hAnsi="仿宋" w:eastAsia="仿宋" w:cs="仿宋"/>
-          <w:sz w:val="24"/>
+          <w:sz w:val="21"/>
           <w:u w:val="single"/>
         </w:rPr>
       </w:r>
       <w:r>
         <w:rPr>
           <w:rFonts w:hint="eastAsia" w:ascii="仿宋" w:hAnsi="仿宋" w:eastAsia="仿宋" w:cs="仿宋"/>
-          <w:sz w:val="24"/>
+          <w:sz w:val="21"/>
           <w:u w:val="single"/>
         </w:rPr>
       </w:r>
       <w:r>
         <w:rPr>
           <w:rFonts w:hint="eastAsia" w:ascii="仿宋" w:hAnsi="仿宋" w:eastAsia="仿宋" w:cs="仿宋"/>
-          <w:sz w:val="24"/>
+          <w:sz w:val="21"/>
           <w:u w:val="single"/>
         </w:rPr>
       </w:r>
       <w:r>
         <w:rPr>
           <w:rFonts w:hint="eastAsia" w:ascii="仿宋" w:hAnsi="仿宋" w:eastAsia="仿宋" w:cs="仿宋"/>
-          <w:sz w:val="24"/>
-        </w:rPr>
-      </w:r>
-      <w:r>
-        <w:rPr>
-          <w:rFonts w:hint="eastAsia" w:ascii="仿宋" w:hAnsi="仿宋" w:eastAsia="仿宋" w:cs="仿宋"/>
-          <w:sz w:val="24"/>
+          <w:sz w:val="21"/>
+        </w:rPr>
+      </w:r>
+      <w:r>
+        <w:rPr>
+          <w:rFonts w:hint="eastAsia" w:ascii="仿宋" w:hAnsi="仿宋" w:eastAsia="仿宋" w:cs="仿宋"/>
+          <w:sz w:val="21"/>
           <w:u w:val="single"/>
         </w:rPr>
       </w:r>
       <w:r>
         <w:rPr>
           <w:rFonts w:hint="eastAsia" w:ascii="仿宋" w:hAnsi="仿宋" w:eastAsia="仿宋" w:cs="仿宋"/>
-          <w:sz w:val="24"/>
+          <w:sz w:val="21"/>
           <w:u w:val="single"/>
         </w:rPr>
       </w:r>
       <w:r>
         <w:rPr>
           <w:rFonts w:hint="eastAsia" w:ascii="仿宋" w:hAnsi="仿宋" w:eastAsia="仿宋" w:cs="仿宋"/>
-          <w:sz w:val="24"/>
+          <w:sz w:val="21"/>
           <w:u w:val="single"/>
         </w:rPr>
       </w:r>
       <w:r>
         <w:rPr>
           <w:rFonts w:hint="eastAsia" w:ascii="仿宋" w:hAnsi="仿宋" w:eastAsia="仿宋" w:cs="仿宋"/>
-          <w:sz w:val="24"/>
+          <w:sz w:val="21"/>
           <w:u w:val="single"/>
         </w:rPr>
       </w:r>
       <w:r>
         <w:rPr>
           <w:rFonts w:hint="eastAsia" w:ascii="仿宋" w:hAnsi="仿宋" w:eastAsia="仿宋" w:cs="仿宋"/>
-          <w:sz w:val="24"/>
+          <w:sz w:val="21"/>
           <w:u w:val="single"/>
         </w:rPr>
       </w:r>
@@ -2906,34 +2926,34 @@
       <w:r>
         <w:rPr>
           <w:rFonts w:hint="eastAsia" w:ascii="仿宋" w:hAnsi="仿宋" w:eastAsia="仿宋" w:cs="仿宋"/>
-          <w:sz w:val="24"/>
+          <w:sz w:val="21"/>
         </w:rPr>
         <w:t>联系地址：{{r supplierRepresentativeAddress }}    邮箱：{{r supplierRepresentativeEmail }}</w:t>
       </w:r>
       <w:r>
         <w:rPr>
           <w:rFonts w:hint="eastAsia" w:ascii="仿宋" w:hAnsi="仿宋" w:eastAsia="仿宋" w:cs="仿宋"/>
-          <w:sz w:val="24"/>
+          <w:sz w:val="21"/>
           <w:u w:val="single"/>
         </w:rPr>
       </w:r>
       <w:r>
         <w:rPr>
           <w:rFonts w:hint="eastAsia" w:ascii="仿宋" w:hAnsi="仿宋" w:eastAsia="仿宋" w:cs="仿宋"/>
-          <w:sz w:val="24"/>
-        </w:rPr>
-      </w:r>
-      <w:r>
-        <w:rPr>
-          <w:rFonts w:hint="eastAsia" w:ascii="仿宋" w:hAnsi="仿宋" w:eastAsia="仿宋" w:cs="仿宋"/>
-          <w:sz w:val="24"/>
+          <w:sz w:val="21"/>
+        </w:rPr>
+      </w:r>
+      <w:r>
+        <w:rPr>
+          <w:rFonts w:hint="eastAsia" w:ascii="仿宋" w:hAnsi="仿宋" w:eastAsia="仿宋" w:cs="仿宋"/>
+          <w:sz w:val="21"/>
           <w:u w:val="single"/>
         </w:rPr>
       </w:r>
       <w:r>
         <w:rPr>
           <w:rFonts w:hint="eastAsia" w:ascii="仿宋" w:hAnsi="仿宋" w:eastAsia="仿宋" w:cs="仿宋"/>
-          <w:sz w:val="24"/>
+          <w:sz w:val="21"/>
         </w:rPr>
       </w:r>
     </w:p>
@@ -2956,7 +2976,7 @@
       <w:r>
         <w:rPr>
           <w:rFonts w:hint="eastAsia" w:ascii="仿宋" w:hAnsi="仿宋" w:eastAsia="仿宋" w:cs="仿宋"/>
-          <w:sz w:val="24"/>
+          <w:sz w:val="21"/>
         </w:rPr>
         <w:t>本合同项下甲方给予乙方的任何通知应以书面作出，并以中文书写，寄送或发送到乙方代表人的地址或邮箱。除非有证据显示有关通知于较早时间已由乙方代表人收悉，否则以邮寄方式的，以寄出凭证上已盖邮戳日起第3日视为送达；以邮件发送的，自成功发送的当日视为送达。乙方代表人及联系地址、方式发生变更的，应自发生变化之日起3日内以书面形式通知甲方，否则应对由此而造成的影响和损失承担责任，甲方按乙方代表人原地址和联系方式发送的通知按本条规则视为送达。</w:t>
       </w:r>
@@ -2981,7 +3001,7 @@
       <w:r>
         <w:rPr>
           <w:rFonts w:hint="eastAsia" w:ascii="仿宋" w:hAnsi="仿宋" w:eastAsia="仿宋" w:cs="仿宋"/>
-          <w:sz w:val="24"/>
+          <w:sz w:val="21"/>
         </w:rPr>
         <w:t>双方确认，乙方代表人的联系方式及地址可作为人民法院送达诉讼文书（含一审、二审、再审、执行等全部程序）的确认地址。同时，乙方同意在发生相关纠纷时可以采用短信、电子送达方式。</w:t>
       </w:r>
@@ -3007,7 +3027,7 @@
         <w:rPr>
           <w:rFonts w:hint="eastAsia" w:ascii="仿宋" w:hAnsi="仿宋" w:eastAsia="仿宋" w:cs="仿宋"/>
           <w:b/>
-          <w:sz w:val="24"/>
+          <w:sz w:val="21"/>
         </w:rPr>
         <w:t>争议解决方式</w:t>
       </w:r>
@@ -3028,7 +3048,7 @@
       <w:r>
         <w:rPr>
           <w:rFonts w:hint="eastAsia" w:ascii="仿宋" w:hAnsi="仿宋" w:eastAsia="仿宋" w:cs="仿宋"/>
-          <w:sz w:val="24"/>
+          <w:sz w:val="21"/>
         </w:rPr>
         <w:t>凡与本合同或执行本合同而发生的一切争议，双方应通过友好协商解决。如协商不成，任何一方均应向合同签订地的人民法院提起诉讼。</w:t>
       </w:r>
@@ -3049,7 +3069,7 @@
       <w:r>
         <w:rPr>
           <w:rFonts w:hint="eastAsia" w:ascii="仿宋" w:hAnsi="仿宋" w:eastAsia="仿宋" w:cs="仿宋"/>
-          <w:sz w:val="24"/>
+          <w:sz w:val="21"/>
         </w:rPr>
         <w:t xml:space="preserve">争议解决过程中，双方应本着保证项目建设正常进行的原则继续履行合同，否则由此造成的甲方损失应由乙方承担。 </w:t>
       </w:r>
@@ -3075,7 +3095,7 @@
         <w:rPr>
           <w:rFonts w:hint="eastAsia" w:ascii="仿宋" w:hAnsi="仿宋" w:eastAsia="仿宋" w:cs="仿宋"/>
           <w:b/>
-          <w:sz w:val="24"/>
+          <w:sz w:val="21"/>
         </w:rPr>
         <w:t>廉洁与诚信商业道德</w:t>
       </w:r>
@@ -3092,7 +3112,7 @@
       <w:r>
         <w:rPr>
           <w:rFonts w:hint="eastAsia" w:ascii="仿宋" w:hAnsi="仿宋" w:eastAsia="仿宋" w:cs="仿宋"/>
-          <w:sz w:val="24"/>
+          <w:sz w:val="21"/>
         </w:rPr>
         <w:t>乙方保证在与甲方的业务活动中恪守廉洁与诚信。若乙方违反其规定，甲方有权利立即解除本合同，并要求乙方承担造成的甲方损失。</w:t>
       </w:r>
@@ -3118,7 +3138,7 @@
         <w:rPr>
           <w:rFonts w:hint="eastAsia" w:ascii="仿宋" w:hAnsi="仿宋" w:eastAsia="仿宋" w:cs="仿宋"/>
           <w:b/>
-          <w:sz w:val="24"/>
+          <w:sz w:val="21"/>
         </w:rPr>
         <w:t xml:space="preserve">其他约定  </w:t>
       </w:r>
@@ -3139,7 +3159,7 @@
       <w:r>
         <w:rPr>
           <w:rFonts w:ascii="仿宋" w:hAnsi="仿宋" w:eastAsia="仿宋" w:cs="仿宋"/>
-          <w:sz w:val="24"/>
+          <w:sz w:val="21"/>
         </w:rPr>
         <w:t>甲方可根据项目实际情况于乙方发货前通知乙方变更或终止采购，乙方应按甲方要求调换货或停止交货。除双方另有约定，甲方无需就该变更或终止向乙方承担违约责任或支付额外费用。如该等变更或终止采购发生在发货后，则甲方应向乙方补偿因此实际增加的运输装卸费用，乙方应提交相关费用证明。如果甲方已支付的货款大于上述补偿费用，乙方应于收到甲方通知后5日内返还差额。</w:t>
       </w:r>
@@ -3160,77 +3180,77 @@
       <w:r>
         <w:rPr>
           <w:rFonts w:ascii="仿宋" w:hAnsi="仿宋" w:eastAsia="仿宋" w:cs="仿宋"/>
-          <w:sz w:val="24"/>
+          <w:sz w:val="21"/>
         </w:rPr>
         <w:t>本合同项下通知应以书面作出，</w:t>
       </w:r>
       <w:r>
         <w:rPr>
           <w:rFonts w:hint="eastAsia" w:ascii="仿宋" w:hAnsi="仿宋" w:eastAsia="仿宋" w:cs="仿宋"/>
-          <w:sz w:val="24"/>
+          <w:sz w:val="21"/>
         </w:rPr>
         <w:t>送达至</w:t>
       </w:r>
       <w:r>
         <w:rPr>
           <w:rFonts w:ascii="仿宋" w:hAnsi="仿宋" w:eastAsia="仿宋" w:cs="仿宋"/>
-          <w:sz w:val="24"/>
+          <w:sz w:val="21"/>
         </w:rPr>
         <w:t>乙方</w:t>
       </w:r>
       <w:r>
         <w:rPr>
           <w:rFonts w:hint="eastAsia" w:ascii="仿宋" w:hAnsi="仿宋" w:eastAsia="仿宋" w:cs="仿宋"/>
-          <w:sz w:val="24"/>
+          <w:sz w:val="21"/>
         </w:rPr>
         <w:t>或乙方</w:t>
       </w:r>
       <w:r>
         <w:rPr>
           <w:rFonts w:ascii="仿宋" w:hAnsi="仿宋" w:eastAsia="仿宋" w:cs="仿宋"/>
-          <w:sz w:val="24"/>
+          <w:sz w:val="21"/>
         </w:rPr>
         <w:t>代表人的地址或邮箱</w:t>
       </w:r>
       <w:r>
         <w:rPr>
           <w:rFonts w:hint="eastAsia" w:ascii="仿宋" w:hAnsi="仿宋" w:eastAsia="仿宋" w:cs="仿宋"/>
-          <w:sz w:val="24"/>
+          <w:sz w:val="21"/>
         </w:rPr>
         <w:t>，或通过短信、微信等通讯方式送达</w:t>
       </w:r>
       <w:r>
         <w:rPr>
           <w:rFonts w:ascii="仿宋" w:hAnsi="仿宋" w:eastAsia="仿宋" w:cs="仿宋"/>
-          <w:sz w:val="24"/>
+          <w:sz w:val="21"/>
         </w:rPr>
         <w:t>。乙方</w:t>
       </w:r>
       <w:r>
         <w:rPr>
           <w:rFonts w:hint="eastAsia" w:ascii="仿宋" w:hAnsi="仿宋" w:eastAsia="仿宋" w:cs="仿宋"/>
-          <w:sz w:val="24"/>
+          <w:sz w:val="21"/>
         </w:rPr>
         <w:t>或</w:t>
       </w:r>
       <w:r>
         <w:rPr>
           <w:rFonts w:ascii="仿宋" w:hAnsi="仿宋" w:eastAsia="仿宋" w:cs="仿宋"/>
-          <w:sz w:val="24"/>
+          <w:sz w:val="21"/>
         </w:rPr>
         <w:t>代表人</w:t>
       </w:r>
       <w:r>
         <w:rPr>
           <w:rFonts w:hint="eastAsia" w:ascii="仿宋" w:hAnsi="仿宋" w:eastAsia="仿宋" w:cs="仿宋"/>
-          <w:sz w:val="24"/>
+          <w:sz w:val="21"/>
         </w:rPr>
         <w:t>的</w:t>
       </w:r>
       <w:r>
         <w:rPr>
           <w:rFonts w:ascii="仿宋" w:hAnsi="仿宋" w:eastAsia="仿宋" w:cs="仿宋"/>
-          <w:sz w:val="24"/>
+          <w:sz w:val="21"/>
         </w:rPr>
         <w:t>联系地址、方式发生变更的，应自发生变化之日起3日内以书面形式通知甲方。</w:t>
       </w:r>
@@ -3251,49 +3271,49 @@
       <w:r>
         <w:rPr>
           <w:rFonts w:ascii="仿宋" w:hAnsi="仿宋" w:eastAsia="仿宋" w:cs="仿宋"/>
-          <w:sz w:val="24"/>
+          <w:sz w:val="21"/>
         </w:rPr>
         <w:t>本合同项下甲方损失的定义包括但不限于因设备质量问题造成的工期延误损失、重新安装损失、项目业主方或其他第三方</w:t>
       </w:r>
       <w:r>
         <w:rPr>
           <w:rFonts w:hint="eastAsia" w:ascii="仿宋" w:hAnsi="仿宋" w:eastAsia="仿宋" w:cs="仿宋"/>
-          <w:sz w:val="24"/>
+          <w:sz w:val="21"/>
         </w:rPr>
         <w:t>对甲方的</w:t>
       </w:r>
       <w:r>
         <w:rPr>
           <w:rFonts w:ascii="仿宋" w:hAnsi="仿宋" w:eastAsia="仿宋" w:cs="仿宋"/>
-          <w:sz w:val="24"/>
+          <w:sz w:val="21"/>
         </w:rPr>
         <w:t>索赔</w:t>
       </w:r>
       <w:r>
         <w:rPr>
           <w:rFonts w:hint="eastAsia" w:ascii="仿宋" w:hAnsi="仿宋" w:eastAsia="仿宋" w:cs="仿宋"/>
-          <w:sz w:val="24"/>
+          <w:sz w:val="21"/>
         </w:rPr>
         <w:t>等</w:t>
       </w:r>
       <w:r>
         <w:rPr>
           <w:rFonts w:ascii="仿宋" w:hAnsi="仿宋" w:eastAsia="仿宋" w:cs="仿宋"/>
-          <w:sz w:val="24"/>
+          <w:sz w:val="21"/>
         </w:rPr>
         <w:t>任何损失</w:t>
       </w:r>
       <w:r>
         <w:rPr>
           <w:rFonts w:hint="eastAsia" w:ascii="仿宋" w:hAnsi="仿宋" w:eastAsia="仿宋" w:cs="仿宋"/>
-          <w:sz w:val="24"/>
+          <w:sz w:val="21"/>
         </w:rPr>
         <w:t>，</w:t>
       </w:r>
       <w:r>
         <w:rPr>
           <w:rFonts w:ascii="仿宋" w:hAnsi="仿宋" w:eastAsia="仿宋" w:cs="仿宋"/>
-          <w:sz w:val="24"/>
+          <w:sz w:val="21"/>
         </w:rPr>
         <w:t>以及甲方向乙方主张权利所发生的诉讼费、律师费、保全担保费、鉴定费、公证费、检测费等一切费用。</w:t>
       </w:r>
@@ -3314,7 +3334,7 @@
       <w:r>
         <w:rPr>
           <w:rFonts w:ascii="仿宋" w:hAnsi="仿宋" w:eastAsia="仿宋" w:cs="仿宋"/>
-          <w:sz w:val="24"/>
+          <w:sz w:val="21"/>
         </w:rPr>
         <w:t>本合同附件是本合同不可分割的一部分，与合同正文具有同等效力。</w:t>
       </w:r>
@@ -3335,7 +3355,7 @@
       <w:r>
         <w:rPr>
           <w:rFonts w:ascii="仿宋" w:hAnsi="仿宋" w:eastAsia="仿宋" w:cs="仿宋"/>
-          <w:sz w:val="24"/>
+          <w:sz w:val="21"/>
         </w:rPr>
         <w:t>本合同正本一式两份，双方各执一份。自双方盖章后生效，如果本合同的任何条款因任何原因无效，该条款的无效并不影响本合同其他条款的有效性和可执行性，各方应当继续履行本合同其他条款。</w:t>
       </w:r>
@@ -3357,14 +3377,14 @@
           <w:rFonts w:hint="eastAsia" w:ascii="仿宋" w:hAnsi="仿宋" w:eastAsia="仿宋" w:cs="仿宋"/>
           <w:b/>
           <w:bCs/>
-          <w:sz w:val="24"/>
+          <w:sz w:val="21"/>
         </w:rPr>
         <w:t>（以下无正文）</w:t>
       </w:r>
       <w:r>
         <w:rPr>
           <w:rFonts w:hint="eastAsia" w:ascii="仿宋" w:hAnsi="仿宋" w:eastAsia="仿宋" w:cs="仿宋"/>
-          <w:sz w:val="24"/>
+          <w:sz w:val="21"/>
         </w:rPr>
         <w:t xml:space="preserve">  </w:t>
       </w:r>
@@ -3402,14 +3422,14 @@
           <w:rFonts w:hint="eastAsia" w:ascii="仿宋" w:hAnsi="仿宋" w:eastAsia="仿宋" w:cs="仿宋"/>
           <w:b/>
           <w:bCs/>
-          <w:sz w:val="24"/>
+          <w:sz w:val="21"/>
         </w:rPr>
         <w:t>甲方：浙江沃乐科技股份有限公司          乙方：{{r supplierName }}</w:t>
       </w:r>
       <w:r>
         <w:rPr>
           <w:rFonts w:hint="eastAsia" w:ascii="仿宋" w:hAnsi="仿宋" w:eastAsia="仿宋" w:cs="仿宋"/>
-          <w:sz w:val="24"/>
+          <w:sz w:val="21"/>
         </w:rPr>
       </w:r>
       <w:r>
@@ -3417,42 +3437,42 @@
           <w:rFonts w:hint="eastAsia" w:ascii="仿宋" w:hAnsi="仿宋" w:eastAsia="仿宋" w:cs="仿宋"/>
           <w:b/>
           <w:bCs/>
-          <w:sz w:val="24"/>
-        </w:rPr>
-      </w:r>
-    </w:p>
-    <w:p>
-      <w:pPr>
-        <w:spacing w:line="360" w:lineRule="auto"/>
-        <w:rPr>
-          <w:rFonts w:hint="eastAsia" w:ascii="仿宋" w:hAnsi="仿宋" w:eastAsia="仿宋" w:cs="仿宋"/>
-          <w:sz w:val="24"/>
-        </w:rPr>
-      </w:pPr>
-      <w:r>
-        <w:rPr>
-          <w:rFonts w:hint="eastAsia" w:ascii="仿宋" w:hAnsi="仿宋" w:eastAsia="仿宋" w:cs="仿宋"/>
-          <w:sz w:val="24"/>
+          <w:sz w:val="21"/>
+        </w:rPr>
+      </w:r>
+    </w:p>
+    <w:p>
+      <w:pPr>
+        <w:spacing w:line="360" w:lineRule="auto"/>
+        <w:rPr>
+          <w:rFonts w:hint="eastAsia" w:ascii="仿宋" w:hAnsi="仿宋" w:eastAsia="仿宋" w:cs="仿宋"/>
+          <w:sz w:val="24"/>
+        </w:rPr>
+      </w:pPr>
+      <w:r>
+        <w:rPr>
+          <w:rFonts w:hint="eastAsia" w:ascii="仿宋" w:hAnsi="仿宋" w:eastAsia="仿宋" w:cs="仿宋"/>
+          <w:sz w:val="21"/>
         </w:rPr>
         <w:t>授权代表：                              授权代表：{{r supplierAuthorizedRepresentative }}</w:t>
       </w:r>
       <w:r>
         <w:rPr>
           <w:rFonts w:hint="eastAsia" w:ascii="仿宋" w:hAnsi="仿宋" w:eastAsia="仿宋" w:cs="仿宋"/>
-          <w:sz w:val="24"/>
+          <w:sz w:val="21"/>
           <w:u w:val="single"/>
         </w:rPr>
       </w:r>
       <w:r>
         <w:rPr>
           <w:rFonts w:hint="eastAsia" w:ascii="仿宋" w:hAnsi="仿宋" w:eastAsia="仿宋" w:cs="仿宋"/>
-          <w:sz w:val="24"/>
-        </w:rPr>
-      </w:r>
-      <w:r>
-        <w:rPr>
-          <w:rFonts w:hint="eastAsia" w:ascii="仿宋" w:hAnsi="仿宋" w:eastAsia="仿宋" w:cs="仿宋"/>
-          <w:sz w:val="24"/>
+          <w:sz w:val="21"/>
+        </w:rPr>
+      </w:r>
+      <w:r>
+        <w:rPr>
+          <w:rFonts w:hint="eastAsia" w:ascii="仿宋" w:hAnsi="仿宋" w:eastAsia="仿宋" w:cs="仿宋"/>
+          <w:sz w:val="21"/>
           <w:u w:val="single"/>
         </w:rPr>
       </w:r>
@@ -3480,86 +3500,86 @@
       <w:r>
         <w:rPr>
           <w:rFonts w:hint="eastAsia" w:ascii="仿宋" w:hAnsi="仿宋" w:eastAsia="仿宋" w:cs="仿宋"/>
-          <w:sz w:val="24"/>
+          <w:sz w:val="21"/>
         </w:rPr>
         <w:t>日期：    年   月                       日期：{{r signatureYear }}年{{r signatureMonth }}月{{r signatureDay }}日</w:t>
       </w:r>
       <w:r>
         <w:rPr>
           <w:rFonts w:hint="eastAsia" w:ascii="仿宋" w:hAnsi="仿宋" w:eastAsia="仿宋" w:cs="仿宋"/>
-          <w:sz w:val="24"/>
+          <w:sz w:val="21"/>
           <w:u w:val="single"/>
         </w:rPr>
       </w:r>
       <w:r>
         <w:rPr>
           <w:rFonts w:hint="eastAsia" w:ascii="仿宋" w:hAnsi="仿宋" w:eastAsia="仿宋" w:cs="仿宋"/>
-          <w:sz w:val="24"/>
-        </w:rPr>
-      </w:r>
-      <w:r>
-        <w:rPr>
-          <w:rFonts w:hint="eastAsia" w:ascii="仿宋" w:hAnsi="仿宋" w:eastAsia="仿宋" w:cs="仿宋"/>
-          <w:sz w:val="24"/>
+          <w:sz w:val="21"/>
+        </w:rPr>
+      </w:r>
+      <w:r>
+        <w:rPr>
+          <w:rFonts w:hint="eastAsia" w:ascii="仿宋" w:hAnsi="仿宋" w:eastAsia="仿宋" w:cs="仿宋"/>
+          <w:sz w:val="21"/>
           <w:u w:val="single"/>
         </w:rPr>
       </w:r>
       <w:r>
         <w:rPr>
           <w:rFonts w:hint="eastAsia" w:ascii="仿宋" w:hAnsi="仿宋" w:eastAsia="仿宋" w:cs="仿宋"/>
-          <w:sz w:val="24"/>
-        </w:rPr>
-      </w:r>
-      <w:r>
-        <w:rPr>
-          <w:rFonts w:hint="eastAsia" w:ascii="仿宋" w:hAnsi="仿宋" w:eastAsia="仿宋" w:cs="仿宋"/>
-          <w:sz w:val="24"/>
+          <w:sz w:val="21"/>
+        </w:rPr>
+      </w:r>
+      <w:r>
+        <w:rPr>
+          <w:rFonts w:hint="eastAsia" w:ascii="仿宋" w:hAnsi="仿宋" w:eastAsia="仿宋" w:cs="仿宋"/>
+          <w:sz w:val="21"/>
           <w:u w:val="single"/>
         </w:rPr>
       </w:r>
       <w:r>
         <w:rPr>
           <w:rFonts w:hint="eastAsia" w:ascii="仿宋" w:hAnsi="仿宋" w:eastAsia="仿宋" w:cs="仿宋"/>
-          <w:sz w:val="24"/>
-        </w:rPr>
-      </w:r>
-      <w:r>
-        <w:rPr>
-          <w:rFonts w:hint="eastAsia" w:ascii="仿宋" w:hAnsi="仿宋" w:eastAsia="仿宋" w:cs="仿宋"/>
-          <w:sz w:val="24"/>
+          <w:sz w:val="21"/>
+        </w:rPr>
+      </w:r>
+      <w:r>
+        <w:rPr>
+          <w:rFonts w:hint="eastAsia" w:ascii="仿宋" w:hAnsi="仿宋" w:eastAsia="仿宋" w:cs="仿宋"/>
+          <w:sz w:val="21"/>
           <w:u w:val="single"/>
         </w:rPr>
       </w:r>
       <w:r>
         <w:rPr>
           <w:rFonts w:hint="eastAsia" w:ascii="仿宋" w:hAnsi="仿宋" w:eastAsia="仿宋" w:cs="仿宋"/>
-          <w:sz w:val="24"/>
-        </w:rPr>
-      </w:r>
-      <w:r>
-        <w:rPr>
-          <w:rFonts w:hint="eastAsia" w:ascii="仿宋" w:hAnsi="仿宋" w:eastAsia="仿宋" w:cs="仿宋"/>
-          <w:sz w:val="24"/>
+          <w:sz w:val="21"/>
+        </w:rPr>
+      </w:r>
+      <w:r>
+        <w:rPr>
+          <w:rFonts w:hint="eastAsia" w:ascii="仿宋" w:hAnsi="仿宋" w:eastAsia="仿宋" w:cs="仿宋"/>
+          <w:sz w:val="21"/>
           <w:u w:val="single"/>
         </w:rPr>
       </w:r>
       <w:r>
         <w:rPr>
           <w:rFonts w:hint="eastAsia" w:ascii="仿宋" w:hAnsi="仿宋" w:eastAsia="仿宋" w:cs="仿宋"/>
-          <w:sz w:val="24"/>
-        </w:rPr>
-      </w:r>
-      <w:r>
-        <w:rPr>
-          <w:rFonts w:hint="eastAsia" w:ascii="仿宋" w:hAnsi="仿宋" w:eastAsia="仿宋" w:cs="仿宋"/>
-          <w:sz w:val="24"/>
+          <w:sz w:val="21"/>
+        </w:rPr>
+      </w:r>
+      <w:r>
+        <w:rPr>
+          <w:rFonts w:hint="eastAsia" w:ascii="仿宋" w:hAnsi="仿宋" w:eastAsia="仿宋" w:cs="仿宋"/>
+          <w:sz w:val="21"/>
           <w:u w:val="single"/>
         </w:rPr>
       </w:r>
       <w:r>
         <w:rPr>
           <w:rFonts w:hint="eastAsia" w:ascii="仿宋" w:hAnsi="仿宋" w:eastAsia="仿宋" w:cs="仿宋"/>
-          <w:sz w:val="24"/>
+          <w:sz w:val="21"/>
         </w:rPr>
       </w:r>
     </w:p>

</xml_diff>